<commit_message>
lawb adversary-complaint, motion-brief: typst and docx on the shared cross-engine layout model; docx/make-reference.sh and reference.docx give way to docx/reference.xml (base="xengine", {font} Times New Roman, was EB Garamond); headings at the 12 pt type size; complaint docx XENG-001..003 pass (166/166 lines), params.cross_engine: gate; motion XENG-001/002 pass, XENG-003 179/181 (typst sets footnote 7 at the foot of p4, its mark opens p5; LibreOffice sets it with the mark), cross_engine: report (fb-595.68.13)
</commit_message>
<xml_diff>
--- a/courts/fifth-circuit/louisiana/federal/bankruptcy-western-district/adversary-complaint/usage/OUTPUT-adversary-complaint.docx
+++ b/courts/fifth-circuit/louisiana/federal/bankruptcy-western-district/adversary-complaint/usage/OUTPUT-adversary-complaint.docx
@@ -4,7 +4,8 @@
   <w:body>
     <w:p>
       <w:pPr>
-        <w:spacing w:before="0" w:after="0" w:line="300" w:lineRule="exact"/>
+        <w:spacing w:before="0" w:after="0" w:line="280" w:lineRule="exact"/>
+        <w:ind w:left="0" w:firstLine="0"/>
         <w:jc w:val="center"/>
       </w:pPr>
       <w:r>
@@ -17,7 +18,8 @@
     </w:p>
     <w:p>
       <w:pPr>
-        <w:spacing w:before="0" w:after="0" w:line="300" w:lineRule="exact"/>
+        <w:spacing w:before="0" w:after="0" w:line="280" w:lineRule="exact"/>
+        <w:ind w:left="0" w:firstLine="0"/>
         <w:jc w:val="center"/>
       </w:pPr>
       <w:r>
@@ -30,7 +32,8 @@
     </w:p>
     <w:p>
       <w:pPr>
-        <w:spacing w:before="0" w:after="0" w:line="300" w:lineRule="exact"/>
+        <w:spacing w:before="0" w:after="0" w:line="280" w:lineRule="exact"/>
+        <w:ind w:left="0" w:firstLine="0"/>
         <w:jc w:val="center"/>
       </w:pPr>
       <w:r>
@@ -43,12 +46,8 @@
     </w:p>
     <w:p>
       <w:pPr>
-        <w:spacing w:before="0" w:after="0" w:line="351" w:lineRule="exact"/>
-      </w:pPr>
-    </w:p>
-    <w:p>
-      <w:pPr>
-        <w:spacing w:before="0" w:after="0" w:line="300" w:lineRule="exact"/>
+        <w:spacing w:before="480" w:after="0" w:line="280" w:lineRule="exact"/>
+        <w:ind w:left="0" w:firstLine="0"/>
         <w:jc w:val="center"/>
       </w:pPr>
       <w:r>
@@ -62,7 +61,7 @@
     </w:p>
     <w:p>
       <w:pPr>
-        <w:spacing w:before="0" w:after="0" w:line="351" w:lineRule="exact"/>
+        <w:spacing w:before="0" w:after="0" w:line="480" w:lineRule="exact"/>
       </w:pPr>
     </w:p>
     <w:tbl>
@@ -75,6 +74,7 @@
           <w:bottom w:w="0" w:type="dxa"/>
           <w:right w:w="0" w:type="dxa"/>
         </w:tblCellMar>
+        <w:tblLook w:val="0000" w:firstRow="0" w:lastRow="0" w:firstColumn="0" w:lastColumn="0" w:noHBand="0" w:noVBand="0"/>
       </w:tblPr>
       <w:tblGrid>
         <w:gridCol w:w="4752"/>
@@ -82,6 +82,9 @@
         <w:gridCol w:w="4248"/>
       </w:tblGrid>
       <w:tr>
+        <w:trPr>
+          <w:cantSplit/>
+        </w:trPr>
         <w:tc>
           <w:tcPr>
             <w:tcW w:w="4752" w:type="dxa"/>
@@ -95,25 +98,47 @@
           </w:tcPr>
           <w:p>
             <w:pPr>
-              <w:spacing w:before="0" w:after="0" w:line="300" w:lineRule="exact"/>
+              <w:spacing w:before="0" w:after="0" w:line="280" w:lineRule="exact"/>
+              <w:ind w:left="0" w:firstLine="0"/>
+              <w:jc w:val="left"/>
             </w:pPr>
             <w:r>
-              <w:t xml:space="preserve">IN RE:</w:t>
+              <w:t xml:space="preserve">IN</w:t>
+            </w:r>
+            <w:r>
+              <w:t xml:space="preserve"> </w:t>
+            </w:r>
+            <w:r>
+              <w:t xml:space="preserve">RE:</w:t>
             </w:r>
           </w:p>
           <w:p>
             <w:pPr>
-              <w:spacing w:before="0" w:after="0" w:line="300" w:lineRule="exact"/>
-              <w:ind w:left="720"/>
+              <w:spacing w:before="0" w:after="0" w:line="280" w:lineRule="exact"/>
+              <w:ind w:left="720" w:firstLine="0"/>
+              <w:jc w:val="left"/>
             </w:pPr>
             <w:r>
-              <w:t xml:space="preserve">ROOSTER PETROLEUM, LLC</w:t>
+              <w:t xml:space="preserve">ROOSTER</w:t>
+            </w:r>
+            <w:r>
+              <w:t xml:space="preserve"> </w:t>
+            </w:r>
+            <w:r>
+              <w:t xml:space="preserve">PETROLEUM,</w:t>
+            </w:r>
+            <w:r>
+              <w:t xml:space="preserve"> </w:t>
+            </w:r>
+            <w:r>
+              <w:t xml:space="preserve">LLC</w:t>
             </w:r>
           </w:p>
           <w:p>
             <w:pPr>
-              <w:spacing w:before="0" w:after="0" w:line="300" w:lineRule="exact"/>
-              <w:ind w:left="720"/>
+              <w:spacing w:before="0" w:after="0" w:line="280" w:lineRule="exact"/>
+              <w:ind w:left="720" w:firstLine="0"/>
+              <w:jc w:val="left"/>
             </w:pPr>
             <w:r>
               <w:t xml:space="preserve">DEBTOR</w:t>
@@ -121,57 +146,91 @@
           </w:p>
           <w:p>
             <w:pPr>
-              <w:spacing w:before="0" w:after="0" w:line="300" w:lineRule="exact"/>
+              <w:spacing w:before="280" w:after="0" w:line="280" w:lineRule="exact"/>
+              <w:ind w:left="0" w:firstLine="0"/>
+              <w:jc w:val="left"/>
             </w:pPr>
+            <w:r>
+              <w:t xml:space="preserve">ELIZABETH</w:t>
+            </w:r>
+            <w:r>
+              <w:t xml:space="preserve"> </w:t>
+            </w:r>
+            <w:r>
+              <w:t xml:space="preserve">G.</w:t>
+            </w:r>
+            <w:r>
+              <w:t xml:space="preserve"> </w:t>
+            </w:r>
+            <w:r>
+              <w:t xml:space="preserve">ANDRUS,</w:t>
+            </w:r>
+            <w:r>
+              <w:t xml:space="preserve"> </w:t>
+            </w:r>
+            <w:r>
+              <w:t xml:space="preserve">TRUSTEE</w:t>
+            </w:r>
           </w:p>
           <w:p>
             <w:pPr>
-              <w:spacing w:before="0" w:after="0" w:line="300" w:lineRule="exact"/>
+              <w:spacing w:before="0" w:after="0" w:line="280" w:lineRule="exact"/>
+              <w:ind w:left="720" w:firstLine="0"/>
+              <w:jc w:val="left"/>
             </w:pPr>
             <w:r>
-              <w:t xml:space="preserve">ELIZABETH G. ANDRUS, TRUSTEE</w:t>
+              <w:t xml:space="preserve">PLAINTIFF</w:t>
             </w:r>
           </w:p>
           <w:p>
             <w:pPr>
-              <w:spacing w:before="0" w:after="0" w:line="300" w:lineRule="exact"/>
-              <w:ind w:left="720"/>
+              <w:spacing w:before="280" w:after="0" w:line="280" w:lineRule="exact"/>
+              <w:ind w:left="1440" w:firstLine="0"/>
+              <w:jc w:val="left"/>
             </w:pPr>
             <w:r>
-              <w:t xml:space="preserve">PLAINTIFF</w:t>
+              <w:t xml:space="preserve">versus</w:t>
             </w:r>
           </w:p>
           <w:p>
             <w:pPr>
-              <w:spacing w:before="0" w:after="0" w:line="300" w:lineRule="exact"/>
+              <w:spacing w:before="280" w:after="0" w:line="280" w:lineRule="exact"/>
+              <w:ind w:left="0" w:firstLine="0"/>
+              <w:jc w:val="left"/>
             </w:pPr>
+            <w:r>
+              <w:t xml:space="preserve">C</w:t>
+            </w:r>
+            <w:r>
+              <w:t xml:space="preserve"> </w:t>
+            </w:r>
+            <w:r>
+              <w:t xml:space="preserve">&amp;</w:t>
+            </w:r>
+            <w:r>
+              <w:t xml:space="preserve"> </w:t>
+            </w:r>
+            <w:r>
+              <w:t xml:space="preserve">G</w:t>
+            </w:r>
+            <w:r>
+              <w:t xml:space="preserve"> </w:t>
+            </w:r>
+            <w:r>
+              <w:t xml:space="preserve">BOATS,</w:t>
+            </w:r>
+            <w:r>
+              <w:t xml:space="preserve"> </w:t>
+            </w:r>
+            <w:r>
+              <w:t xml:space="preserve">INC.</w:t>
+            </w:r>
           </w:p>
           <w:p>
             <w:pPr>
-              <w:spacing w:before="0" w:after="0" w:line="300" w:lineRule="exact"/>
-              <w:ind w:left="1440"/>
-            </w:pPr>
-            <w:r>
-              <w:t xml:space="preserve">versus</w:t>
-            </w:r>
-          </w:p>
-          <w:p>
-            <w:pPr>
-              <w:spacing w:before="0" w:after="0" w:line="300" w:lineRule="exact"/>
-            </w:pPr>
-          </w:p>
-          <w:p>
-            <w:pPr>
-              <w:spacing w:before="0" w:after="0" w:line="300" w:lineRule="exact"/>
-            </w:pPr>
-            <w:r>
-              <w:t xml:space="preserve">C &amp; G BOATS, INC.</w:t>
-            </w:r>
-          </w:p>
-          <w:p>
-            <w:pPr>
-              <w:spacing w:before="0" w:after="0" w:line="300" w:lineRule="exact"/>
-              <w:ind w:left="1440"/>
+              <w:spacing w:before="0" w:after="0" w:line="280" w:lineRule="exact"/>
+              <w:ind w:left="1440" w:firstLine="0"/>
+              <w:jc w:val="left"/>
             </w:pPr>
             <w:r>
               <w:t xml:space="preserve">DEFENDANT</w:t>
@@ -182,7 +241,13 @@
           <w:tcPr>
             <w:tcW w:w="360" w:type="dxa"/>
           </w:tcPr>
-          <w:p/>
+          <w:p>
+            <w:pPr>
+              <w:spacing w:before="0" w:after="0" w:line="280" w:lineRule="exact"/>
+              <w:ind w:left="0" w:firstLine="0"/>
+              <w:jc w:val="left"/>
+            </w:pPr>
+          </w:p>
         </w:tc>
         <w:tc>
           <w:tcPr>
@@ -193,10 +258,82 @@
           </w:tcPr>
           <w:p>
             <w:pPr>
-              <w:spacing w:before="0" w:after="0" w:line="300" w:lineRule="exact"/>
+              <w:spacing w:before="0" w:after="0" w:line="280" w:lineRule="exact"/>
+              <w:ind w:left="0" w:firstLine="0"/>
+              <w:jc w:val="left"/>
             </w:pPr>
             <w:r>
-              <w:t xml:space="preserve">CASE NO.: 17-50708CHAPTER 7 CASEADVERSARY PROCEEDINGNO.: 19-05061</w:t>
+              <w:t xml:space="preserve">CASE</w:t>
+            </w:r>
+            <w:r>
+              <w:t xml:space="preserve"> </w:t>
+            </w:r>
+            <w:r>
+              <w:t xml:space="preserve">NO.:</w:t>
+            </w:r>
+            <w:r>
+              <w:t xml:space="preserve"> </w:t>
+            </w:r>
+            <w:r>
+              <w:t xml:space="preserve">17</w:t>
+              <w:noBreakHyphen/>
+              <w:t xml:space="preserve">50708</w:t>
+            </w:r>
+          </w:p>
+          <w:p>
+            <w:pPr>
+              <w:spacing w:before="0" w:after="0" w:line="280" w:lineRule="exact"/>
+              <w:ind w:left="0" w:firstLine="0"/>
+              <w:jc w:val="left"/>
+            </w:pPr>
+            <w:r>
+              <w:t xml:space="preserve">CHAPTER</w:t>
+            </w:r>
+            <w:r>
+              <w:t xml:space="preserve"> </w:t>
+            </w:r>
+            <w:r>
+              <w:t xml:space="preserve">7</w:t>
+            </w:r>
+            <w:r>
+              <w:t xml:space="preserve"> </w:t>
+            </w:r>
+            <w:r>
+              <w:t xml:space="preserve">CASE</w:t>
+            </w:r>
+          </w:p>
+          <w:p>
+            <w:pPr>
+              <w:spacing w:before="280" w:after="0" w:line="280" w:lineRule="exact"/>
+              <w:ind w:left="0" w:firstLine="0"/>
+              <w:jc w:val="left"/>
+            </w:pPr>
+            <w:r>
+              <w:t xml:space="preserve">ADVERSARY</w:t>
+            </w:r>
+            <w:r>
+              <w:t xml:space="preserve"> </w:t>
+            </w:r>
+            <w:r>
+              <w:t xml:space="preserve">PROCEEDING</w:t>
+            </w:r>
+          </w:p>
+          <w:p>
+            <w:pPr>
+              <w:spacing w:before="0" w:after="0" w:line="280" w:lineRule="exact"/>
+              <w:ind w:left="0" w:firstLine="0"/>
+              <w:jc w:val="left"/>
+            </w:pPr>
+            <w:r>
+              <w:t xml:space="preserve">NO.:</w:t>
+            </w:r>
+            <w:r>
+              <w:t xml:space="preserve"> </w:t>
+            </w:r>
+            <w:r>
+              <w:t xml:space="preserve">19</w:t>
+              <w:noBreakHyphen/>
+              <w:t xml:space="preserve">05061</w:t>
             </w:r>
           </w:p>
         </w:tc>
@@ -204,12 +341,12 @@
     </w:tbl>
     <w:p>
       <w:pPr>
-        <w:spacing w:before="0" w:after="0" w:line="351" w:lineRule="exact"/>
-      </w:pPr>
-    </w:p>
-    <w:p>
-      <w:pPr>
-        <w:pStyle w:val="UnnumberedParagraph"/>
+        <w:spacing w:before="0" w:after="0" w:line="480" w:lineRule="exact"/>
+      </w:pPr>
+    </w:p>
+    <w:p>
+      <w:pPr>
+        <w:pStyle w:val="BodyText"/>
       </w:pPr>
       <w:r>
         <w:t xml:space="preserve">NOW INTO COURT, through undersigned counsel, comes Elizabeth G. Andrus, the chapter 7 trustee (</w:t>
@@ -233,7 +370,6 @@
         <w:t xml:space="preserve">) for the bankruptcy estate of Rooster Petroleum, LLC, a Delaware limited liability company, who respectfully represents as follows:</w:t>
       </w:r>
     </w:p>
-    <w:bookmarkStart w:id="20" w:name="jurisdiction"/>
     <w:p>
       <w:pPr>
         <w:pStyle w:val="Heading1"/>
@@ -253,7 +389,7 @@
         <w:tab/>
       </w:r>
       <w:r>
-        <w:t xml:space="preserve">This Court has subject matter jurisdiction over this matter pursuant to 11 U.S.C. § 105, 28 U.S.C. §§ 1334 and 157, and by virtue of the reference by the district court pursuant to ULLR 83.4.1. This matter is a</w:t>
+        <w:t xml:space="preserve">This Court has subject matter jurisdiction over this matter pursuant to 11 U.S.C. § 105, 28 U.S.C. §§ 1334 and 157, and by virtue of the reference by the district court pursuant to ULLR 83.4.1. This matter is a</w:t>
       </w:r>
       <w:r>
         <w:t xml:space="preserve"> </w:t>
@@ -265,7 +401,7 @@
         <w:t xml:space="preserve"> </w:t>
       </w:r>
       <w:r>
-        <w:t xml:space="preserve">proceeding pursuant to 28 U.S.C. § 157 (b)(2)(A), (F), (H) and (O).</w:t>
+        <w:t xml:space="preserve">proceeding pursuant to 28 U.S.C. § 157 (b)⁠(2)⁠(A), (F), (H) and (O).</w:t>
       </w:r>
     </w:p>
     <w:p>
@@ -296,8 +432,6 @@
         <w:t xml:space="preserve">This Court has personal jurisdiction over the Defendant because it conducted business within the United States and all or a substantial part of the events or omissions giving rise to the claims set forth below occurred within the United States.</w:t>
       </w:r>
     </w:p>
-    <w:bookmarkEnd w:id="20"/>
-    <w:bookmarkStart w:id="21" w:name="venue"/>
     <w:p>
       <w:pPr>
         <w:pStyle w:val="Heading1"/>
@@ -317,11 +451,9 @@
         <w:tab/>
       </w:r>
       <w:r>
-        <w:t xml:space="preserve">Venue of this action lies in this Court pursuant to 28 U.S.C. § 1409 because the claims set forth below arose from or relate to the above referenced bankruptcy case pending in this Court.</w:t>
-      </w:r>
-    </w:p>
-    <w:bookmarkEnd w:id="21"/>
-    <w:bookmarkStart w:id="22" w:name="parties"/>
+        <w:t xml:space="preserve">Venue of this action lies in this Court pursuant to 28 U.S.C. § 1409 because the claims set forth below arose from or relate to the above referenced bankruptcy case pending in this Court.</w:t>
+      </w:r>
+    </w:p>
     <w:p>
       <w:pPr>
         <w:pStyle w:val="Heading1"/>
@@ -355,7 +487,7 @@
         <w:tab/>
       </w:r>
       <w:r>
-        <w:t xml:space="preserve">The defendant herein is: C &amp; G Boats, Inc. (</w:t>
+        <w:t xml:space="preserve">The defendant herein is: C &amp; G Boats, Inc. (</w:t>
       </w:r>
       <w:r>
         <w:t xml:space="preserve">“Defendant”</w:t>
@@ -364,8 +496,6 @@
         <w:t xml:space="preserve">), whose mailing address is 1216 South Bayou Drive, Golden Meadow, La. 70357 and whose registered agent for service of process is: Magnus J. Arceneaux, III, 117 Branton Drive, Lafayette, La. 70508.</w:t>
       </w:r>
     </w:p>
-    <w:bookmarkEnd w:id="22"/>
-    <w:bookmarkStart w:id="23" w:name="background-facts"/>
     <w:p>
       <w:pPr>
         <w:pStyle w:val="Heading1"/>
@@ -449,7 +579,7 @@
         <w:tab/>
       </w:r>
       <w:r>
-        <w:t xml:space="preserve">Pursuant to the provisions of § 541(a) of the Bankruptcy Code, upon the commencement of this bankruptcy case, an estate was created, comprised of all property, wherever located and by whomever held, including all legal and equitable interests of the Debtor in property as of the commencement of the case.</w:t>
+        <w:t xml:space="preserve">Pursuant to the provisions of § 541(a) of the Bankruptcy Code, upon the commencement of this bankruptcy case, an estate was created, comprised of all property, wherever located and by whomever held, including all legal and equitable interests of the Debtor in property as of the commencement of the case.</w:t>
       </w:r>
     </w:p>
     <w:p>
@@ -463,7 +593,7 @@
         <w:tab/>
       </w:r>
       <w:r>
-        <w:t xml:space="preserve">Pursuant to the provisions of § 323(a) of the Bankruptcy Code, the Trustee holds all of the rights and responsibility for property of the estate and is the sole representative of the bankruptcy estate. In re General Development Corp., 179 B.R. 335, 338 (S.D. Fla. 1995) (</w:t>
+        <w:t xml:space="preserve">Pursuant to the provisions of § 323(a) of the Bankruptcy Code, the Trustee holds all of the rights and responsibility for property of the estate and is the sole representative of the bankruptcy estate. In re General Development Corp., 179 B.R. 335, 338 (S.D. Fla. 1995) (</w:t>
       </w:r>
       <w:r>
         <w:t xml:space="preserve">“The bankruptcy trustee is vested with title to all assets of the estate and becomes the estate’s legal representative.”</w:t>
@@ -483,7 +613,7 @@
         <w:tab/>
       </w:r>
       <w:r>
-        <w:t xml:space="preserve">As the sole representative of the bankruptcy estate, and pursuant to the provisions of § 704(a)(1) of the Bankruptcy Code, the Trustee has a duty to collect and reduce to money the property of the estate, including all claims or causes of action arising under chapter 5 of the Bankruptcy Code.</w:t>
+        <w:t xml:space="preserve">As the sole representative of the bankruptcy estate, and pursuant to the provisions of § 704(a)⁠(1) of the Bankruptcy Code, the Trustee has a duty to collect and reduce to money the property of the estate, including all claims or causes of action arising under chapter 5 of the Bankruptcy Code.</w:t>
       </w:r>
     </w:p>
     <w:p>
@@ -553,7 +683,7 @@
         <w:tab/>
       </w:r>
       <w:r>
-        <w:t xml:space="preserve">According to the response to question 3 of the statement of financial affairs filed pursuant to § 521(a)(1)(B)(iii) of the Bankruptcy Code and Bankruptcy Rule 1007, within the ninety (90) days prior to the date of the filing of the petition, on account of an antecedent debt owed by the Debtor, the Debtor remitted to the Defendant payment(s) or other transfers of property or an interest of the Debtor in property, each of which constituted</w:t>
+        <w:t xml:space="preserve">According to the response to question 3 of the statement of financial affairs filed pursuant to § 521(a)⁠(1)⁠(B)⁠(iii) of the Bankruptcy Code and Bankruptcy Rule 1007, within the ninety (90) days prior to the date of the filing of the petition, on account of an antecedent debt owed by the Debtor, the Debtor remitted to the Defendant payment(s) or other transfers of property or an interest of the Debtor in property, each of which constituted</w:t>
       </w:r>
       <w:r>
         <w:t xml:space="preserve"> </w:t>
@@ -565,7 +695,7 @@
         <w:t xml:space="preserve"> </w:t>
       </w:r>
       <w:r>
-        <w:t xml:space="preserve">within the meaning of § 101(54)(D) of the Bankruptcy Code (defining</w:t>
+        <w:t xml:space="preserve">within the meaning of § 101(54)⁠(D) of the Bankruptcy Code (defining</w:t>
       </w:r>
       <w:r>
         <w:t xml:space="preserve"> </w:t>
@@ -602,62 +732,124 @@
       <w:r>
         <w:t xml:space="preserve">Upon information and belief, the Debtor made transfers to or for the benefit of the Defendant within the ninety (90) days prior to the date of the filing of the petition, on account of an antecedent debt owed by the Debtor, in the total amount of $ 225,254.00, as follows:</w:t>
       </w:r>
+    </w:p>
+    <w:p>
+      <w:pPr>
+        <w:spacing w:before="0" w:after="0" w:line="240" w:lineRule="exact"/>
+      </w:pPr>
     </w:p>
     <w:tbl>
       <w:tblPr>
-        <w:tblStyle w:val="Table"/>
-        <w:tblW w:type="auto" w:w="0"/>
-        <w:tblLook w:firstRow="1" w:lastRow="0" w:firstColumn="0" w:lastColumn="0" w:noHBand="0" w:noVBand="0" w:val="0020"/>
+        <w:tblW w:w="9360" w:type="dxa"/>
+        <w:tblLayout w:type="fixed"/>
+        <w:tblCellMar>
+          <w:top w:w="60" w:type="dxa"/>
+          <w:left w:w="120" w:type="dxa"/>
+          <w:bottom w:w="60" w:type="dxa"/>
+          <w:right w:w="120" w:type="dxa"/>
+        </w:tblCellMar>
+        <w:tblLook w:val="0000" w:firstRow="0" w:lastRow="0" w:firstColumn="0" w:lastColumn="0" w:noHBand="0" w:noVBand="0"/>
       </w:tblPr>
       <w:tblGrid>
-        <w:gridCol w:w="2640"/>
-        <w:gridCol w:w="2640"/>
-        <w:gridCol w:w="2640"/>
+        <w:gridCol w:w="3066"/>
+        <w:gridCol w:w="3873"/>
+        <w:gridCol w:w="2421"/>
       </w:tblGrid>
       <w:tr>
         <w:trPr>
-          <w:tblHeader w:val="on"/>
+          <w:cantSplit/>
         </w:trPr>
         <w:tc>
-          <w:tcPr/>
+          <w:tcPr>
+            <w:tcW w:w="3066" w:type="dxa"/>
+          </w:tcPr>
           <w:p>
             <w:pPr>
-              <w:pStyle w:val="Compact"/>
+              <w:keepNext/>
+              <w:keepLines/>
+              <w:spacing w:before="0" w:after="0" w:line="280" w:lineRule="exact"/>
+              <w:ind w:left="0" w:firstLine="0"/>
+              <w:jc w:val="left"/>
             </w:pPr>
             <w:r>
-              <w:t xml:space="preserve">Check/Wire No.</w:t>
+              <w:t xml:space="preserve">Check/​Wire</w:t>
+            </w:r>
+            <w:r>
+              <w:t xml:space="preserve"> </w:t>
+            </w:r>
+            <w:r>
+              <w:t xml:space="preserve">No.</w:t>
             </w:r>
           </w:p>
         </w:tc>
         <w:tc>
-          <w:tcPr/>
+          <w:tcPr>
+            <w:tcW w:w="3873" w:type="dxa"/>
+          </w:tcPr>
           <w:p>
             <w:pPr>
-              <w:pStyle w:val="Compact"/>
+              <w:keepNext/>
+              <w:keepLines/>
+              <w:spacing w:before="0" w:after="0" w:line="280" w:lineRule="exact"/>
+              <w:ind w:left="0" w:firstLine="0"/>
+              <w:jc w:val="left"/>
             </w:pPr>
             <w:r>
-              <w:t xml:space="preserve">Check Clearance Date</w:t>
+              <w:t xml:space="preserve">Check</w:t>
+            </w:r>
+            <w:r>
+              <w:t xml:space="preserve"> </w:t>
+            </w:r>
+            <w:r>
+              <w:t xml:space="preserve">Clearance</w:t>
+            </w:r>
+            <w:r>
+              <w:t xml:space="preserve"> </w:t>
+            </w:r>
+            <w:r>
+              <w:t xml:space="preserve">Date</w:t>
             </w:r>
           </w:p>
         </w:tc>
         <w:tc>
-          <w:tcPr/>
+          <w:tcPr>
+            <w:tcW w:w="2421" w:type="dxa"/>
+          </w:tcPr>
           <w:p>
             <w:pPr>
-              <w:pStyle w:val="Compact"/>
+              <w:keepNext/>
+              <w:keepLines/>
+              <w:spacing w:before="0" w:after="0" w:line="280" w:lineRule="exact"/>
+              <w:ind w:left="0" w:firstLine="0"/>
+              <w:jc w:val="left"/>
             </w:pPr>
             <w:r>
-              <w:t xml:space="preserve">Amount Paid</w:t>
+              <w:t xml:space="preserve">Amount</w:t>
+            </w:r>
+            <w:r>
+              <w:t xml:space="preserve"> </w:t>
+            </w:r>
+            <w:r>
+              <w:t xml:space="preserve">Paid</w:t>
             </w:r>
           </w:p>
         </w:tc>
       </w:tr>
       <w:tr>
+        <w:trPr>
+          <w:cantSplit/>
+        </w:trPr>
         <w:tc>
-          <w:tcPr/>
+          <w:tcPr>
+            <w:tcW w:w="3066" w:type="dxa"/>
+          </w:tcPr>
           <w:p>
             <w:pPr>
-              <w:pStyle w:val="Compact"/>
+              <w:keepNext/>
+              <w:keepLines/>
+              <w:spacing w:before="0" w:after="0" w:line="280" w:lineRule="exact"/>
+              <w:ind w:left="0" w:firstLine="0"/>
+              <w:jc w:val="left"/>
             </w:pPr>
             <w:r>
               <w:t xml:space="preserve">108648</w:t>
@@ -665,10 +857,16 @@
           </w:p>
         </w:tc>
         <w:tc>
-          <w:tcPr/>
+          <w:tcPr>
+            <w:tcW w:w="3873" w:type="dxa"/>
+          </w:tcPr>
           <w:p>
             <w:pPr>
-              <w:pStyle w:val="Compact"/>
+              <w:keepNext/>
+              <w:keepLines/>
+              <w:spacing w:before="0" w:after="0" w:line="280" w:lineRule="exact"/>
+              <w:ind w:left="0" w:firstLine="0"/>
+              <w:jc w:val="left"/>
             </w:pPr>
             <w:r>
               <w:t xml:space="preserve">3/20/2017</w:t>
@@ -676,10 +874,16 @@
           </w:p>
         </w:tc>
         <w:tc>
-          <w:tcPr/>
+          <w:tcPr>
+            <w:tcW w:w="2421" w:type="dxa"/>
+          </w:tcPr>
           <w:p>
             <w:pPr>
-              <w:pStyle w:val="Compact"/>
+              <w:keepNext/>
+              <w:keepLines/>
+              <w:spacing w:before="0" w:after="0" w:line="280" w:lineRule="exact"/>
+              <w:ind w:left="0" w:firstLine="0"/>
+              <w:jc w:val="left"/>
             </w:pPr>
             <w:r>
               <w:t xml:space="preserve">$99,222.00</w:t>
@@ -688,11 +892,20 @@
         </w:tc>
       </w:tr>
       <w:tr>
+        <w:trPr>
+          <w:cantSplit/>
+        </w:trPr>
         <w:tc>
-          <w:tcPr/>
+          <w:tcPr>
+            <w:tcW w:w="3066" w:type="dxa"/>
+          </w:tcPr>
           <w:p>
             <w:pPr>
-              <w:pStyle w:val="Compact"/>
+              <w:keepNext/>
+              <w:keepLines/>
+              <w:spacing w:before="0" w:after="0" w:line="280" w:lineRule="exact"/>
+              <w:ind w:left="0" w:firstLine="0"/>
+              <w:jc w:val="left"/>
             </w:pPr>
             <w:r>
               <w:t xml:space="preserve">108726</w:t>
@@ -700,10 +913,16 @@
           </w:p>
         </w:tc>
         <w:tc>
-          <w:tcPr/>
+          <w:tcPr>
+            <w:tcW w:w="3873" w:type="dxa"/>
+          </w:tcPr>
           <w:p>
             <w:pPr>
-              <w:pStyle w:val="Compact"/>
+              <w:keepNext/>
+              <w:keepLines/>
+              <w:spacing w:before="0" w:after="0" w:line="280" w:lineRule="exact"/>
+              <w:ind w:left="0" w:firstLine="0"/>
+              <w:jc w:val="left"/>
             </w:pPr>
             <w:r>
               <w:t xml:space="preserve">3/28/2017</w:t>
@@ -711,10 +930,16 @@
           </w:p>
         </w:tc>
         <w:tc>
-          <w:tcPr/>
+          <w:tcPr>
+            <w:tcW w:w="2421" w:type="dxa"/>
+          </w:tcPr>
           <w:p>
             <w:pPr>
-              <w:pStyle w:val="Compact"/>
+              <w:keepNext/>
+              <w:keepLines/>
+              <w:spacing w:before="0" w:after="0" w:line="280" w:lineRule="exact"/>
+              <w:ind w:left="0" w:firstLine="0"/>
+              <w:jc w:val="left"/>
             </w:pPr>
             <w:r>
               <w:t xml:space="preserve">$116,920.00</w:t>
@@ -723,11 +948,20 @@
         </w:tc>
       </w:tr>
       <w:tr>
+        <w:trPr>
+          <w:cantSplit/>
+        </w:trPr>
         <w:tc>
-          <w:tcPr/>
+          <w:tcPr>
+            <w:tcW w:w="3066" w:type="dxa"/>
+          </w:tcPr>
           <w:p>
             <w:pPr>
-              <w:pStyle w:val="Compact"/>
+              <w:keepNext/>
+              <w:keepLines/>
+              <w:spacing w:before="0" w:after="0" w:line="280" w:lineRule="exact"/>
+              <w:ind w:left="0" w:firstLine="0"/>
+              <w:jc w:val="left"/>
             </w:pPr>
             <w:r>
               <w:t xml:space="preserve">108759</w:t>
@@ -735,10 +969,16 @@
           </w:p>
         </w:tc>
         <w:tc>
-          <w:tcPr/>
+          <w:tcPr>
+            <w:tcW w:w="3873" w:type="dxa"/>
+          </w:tcPr>
           <w:p>
             <w:pPr>
-              <w:pStyle w:val="Compact"/>
+              <w:keepNext/>
+              <w:keepLines/>
+              <w:spacing w:before="0" w:after="0" w:line="280" w:lineRule="exact"/>
+              <w:ind w:left="0" w:firstLine="0"/>
+              <w:jc w:val="left"/>
             </w:pPr>
             <w:r>
               <w:t xml:space="preserve">4/11/2017</w:t>
@@ -746,10 +986,16 @@
           </w:p>
         </w:tc>
         <w:tc>
-          <w:tcPr/>
+          <w:tcPr>
+            <w:tcW w:w="2421" w:type="dxa"/>
+          </w:tcPr>
           <w:p>
             <w:pPr>
-              <w:pStyle w:val="Compact"/>
+              <w:keepNext/>
+              <w:keepLines/>
+              <w:spacing w:before="0" w:after="0" w:line="280" w:lineRule="exact"/>
+              <w:ind w:left="0" w:firstLine="0"/>
+              <w:jc w:val="left"/>
             </w:pPr>
             <w:r>
               <w:t xml:space="preserve">$9112.00</w:t>
@@ -758,11 +1004,18 @@
         </w:tc>
       </w:tr>
       <w:tr>
+        <w:trPr>
+          <w:cantSplit/>
+        </w:trPr>
         <w:tc>
-          <w:tcPr/>
+          <w:tcPr>
+            <w:tcW w:w="3066" w:type="dxa"/>
+          </w:tcPr>
           <w:p>
             <w:pPr>
-              <w:pStyle w:val="Compact"/>
+              <w:spacing w:before="0" w:after="0" w:line="280" w:lineRule="exact"/>
+              <w:ind w:left="0" w:firstLine="0"/>
+              <w:jc w:val="left"/>
             </w:pPr>
             <w:r>
               <w:rPr>
@@ -774,18 +1027,26 @@
           </w:p>
         </w:tc>
         <w:tc>
-          <w:tcPr/>
+          <w:tcPr>
+            <w:tcW w:w="3873" w:type="dxa"/>
+          </w:tcPr>
           <w:p>
             <w:pPr>
-              <w:pStyle w:val="Compact"/>
+              <w:spacing w:before="0" w:after="0" w:line="280" w:lineRule="exact"/>
+              <w:ind w:left="0" w:firstLine="0"/>
+              <w:jc w:val="left"/>
             </w:pPr>
           </w:p>
         </w:tc>
         <w:tc>
-          <w:tcPr/>
+          <w:tcPr>
+            <w:tcW w:w="2421" w:type="dxa"/>
+          </w:tcPr>
           <w:p>
             <w:pPr>
-              <w:pStyle w:val="Compact"/>
+              <w:spacing w:before="0" w:after="0" w:line="280" w:lineRule="exact"/>
+              <w:ind w:left="0" w:firstLine="0"/>
+              <w:jc w:val="left"/>
             </w:pPr>
             <w:r>
               <w:rPr>
@@ -800,12 +1061,12 @@
     </w:tbl>
     <w:p>
       <w:pPr>
-        <w:spacing w:before="0" w:after="0" w:line="351" w:lineRule="exact"/>
-      </w:pPr>
-    </w:p>
-    <w:p>
-      <w:pPr>
-        <w:pStyle w:val="UnnumberedParagraph"/>
+        <w:spacing w:before="0" w:after="0" w:line="240" w:lineRule="exact"/>
+      </w:pPr>
+    </w:p>
+    <w:p>
+      <w:pPr>
+        <w:pStyle w:val="BodyText"/>
       </w:pPr>
       <w:r>
         <w:t xml:space="preserve">(the foregoing amounts are sometimes collectively referred to as the</w:t>
@@ -831,11 +1092,9 @@
         <w:tab/>
       </w:r>
       <w:r>
-        <w:t xml:space="preserve">The Transfers identified in this complaint occurred at a time when the Debtor was presumed to be insolvent under 11 U.S.C. § 547(f).</w:t>
-      </w:r>
-    </w:p>
-    <w:bookmarkEnd w:id="23"/>
-    <w:bookmarkStart w:id="24" w:name="count-i---preferential-transfer"/>
+        <w:t xml:space="preserve">The Transfers identified in this complaint occurred at a time when the Debtor was presumed to be insolvent under 11 U.S.C. § 547(f).</w:t>
+      </w:r>
+    </w:p>
     <w:p>
       <w:pPr>
         <w:pStyle w:val="Heading1"/>
@@ -869,7 +1128,7 @@
         <w:tab/>
       </w:r>
       <w:r>
-        <w:t xml:space="preserve">This count is premised on the Trustee’s avoidance powers under § 547(b) of the Bankruptcy Code which provides that the trustee of a bankruptcy estate may avoid as a preferential transfer any transfer made by an insolvent Debtor in the ninety days preceding bankruptcy, where the transfer (i) was made to or for the benefit of a creditor; (ii) was made for or on account of an antecedent debt owed by the Debtor; and (iii) enabled the creditor to receive more than it otherwise would have under the provisions of the Bankruptcy Code.</w:t>
+        <w:t xml:space="preserve">This count is premised on the Trustee’s avoidance powers under § 547(b) of the Bankruptcy Code which provides that the trustee of a bankruptcy estate may avoid as a preferential transfer any transfer made by an insolvent Debtor in the ninety days preceding bankruptcy, where the transfer (i) was made to or for the benefit of a creditor; (ii) was made for or on account of an antecedent debt owed by the Debtor; and (iii) enabled the creditor to receive more than it otherwise would have under the provisions of the Bankruptcy Code.</w:t>
       </w:r>
     </w:p>
     <w:p>
@@ -883,7 +1142,7 @@
         <w:tab/>
       </w:r>
       <w:r>
-        <w:t xml:space="preserve">The payments and transfers referred to above are preferential and are subject to avoidance within the meaning of § 547 of the Bankruptcy Code because such payments and transfers were: (i) to or for the benefit of a creditor; (ii) for or on account of an antecedent debt owed by the Debtor; (iii) made while the Debtor was insolvent; (iv) made on or within ninety (90) days before the date of the filing of the petition or between ninety (90) days and one (1) year before the date of the filing of the petition; and (v) enabled the Defendant to receive more than such creditor would receive if the case were a case under chapter 7 of the Bankruptcy Code, the payments or transfers had not been made, and such creditor received payment of such debt to the extent provided by the provisions of the Bankruptcy Code.</w:t>
+        <w:t xml:space="preserve">The payments and transfers referred to above are preferential and are subject to avoidance within the meaning of § 547 of the Bankruptcy Code because such payments and transfers were: (i) to or for the benefit of a creditor; (ii) for or on account of an antecedent debt owed by the Debtor; (iii) made while the Debtor was insolvent; (iv) made on or within ninety (90) days before the date of the filing of the petition or between ninety (90) days and one (1) year before the date of the filing of the petition; and (v) enabled the Defendant to receive more than such creditor would receive if the case were a case under chapter 7 of the Bankruptcy Code, the payments or transfers had not been made, and such creditor received payment of such debt to the extent provided by the provisions of the Bankruptcy Code.</w:t>
       </w:r>
     </w:p>
     <w:p>
@@ -914,8 +1173,6 @@
         <w:t xml:space="preserve">The Trustee seeks to recover the value of the transfers under section 550 of the Bankruptcy Code and other applicable sections.</w:t>
       </w:r>
     </w:p>
-    <w:bookmarkEnd w:id="24"/>
-    <w:bookmarkStart w:id="25" w:name="X711d989bb8627c9b601864b2cdf1d77d84fb37c"/>
     <w:p>
       <w:pPr>
         <w:pStyle w:val="Heading1"/>
@@ -952,8 +1209,6 @@
         <w:t xml:space="preserve">The Trustee therefore prays for judgment disallowing any claim of the Defendant unless such entity or transferee pays the amount prayed for in this Complaint.</w:t>
       </w:r>
     </w:p>
-    <w:bookmarkEnd w:id="25"/>
-    <w:bookmarkStart w:id="26" w:name="relief-requested"/>
     <w:p>
       <w:pPr>
         <w:pStyle w:val="Heading1"/>
@@ -973,7 +1228,7 @@
         <w:tab/>
       </w:r>
       <w:r>
-        <w:t xml:space="preserve">The trustee seeks to avoid any transfer of an interest of the debtor in property that is avoidable under applicable law by a creditor holding an allowed unsecured claim pursuant to the provisions of § 544(b) of the Bankruptcy Code (the</w:t>
+        <w:t xml:space="preserve">The trustee seeks to avoid any transfer of an interest of the debtor in property that is avoidable under applicable law by a creditor holding an allowed unsecured claim pursuant to the provisions of § 544(b) of the Bankruptcy Code (the</w:t>
       </w:r>
       <w:r>
         <w:t xml:space="preserve"> </w:t>
@@ -1008,7 +1263,7 @@
         <w:tab/>
       </w:r>
       <w:r>
-        <w:t xml:space="preserve">With respect to any avoided transfer, the Trustee seeks the entry of a judgment awarding any remedy available under § 550 of the Bankruptcy Code, including the recovery, for the benefit of the estate, of the entire transfer avoided or the recovery of a money judgment in an amount equal to the value of the property transferred.</w:t>
+        <w:t xml:space="preserve">With respect to any avoided transfer, the Trustee seeks the entry of a judgment awarding any remedy available under § 550 of the Bankruptcy Code, including the recovery, for the benefit of the estate, of the entire transfer avoided or the recovery of a money judgment in an amount equal to the value of the property transferred.</w:t>
       </w:r>
     </w:p>
     <w:p>
@@ -1027,7 +1282,7 @@
     </w:p>
     <w:p>
       <w:pPr>
-        <w:pStyle w:val="UnnumberedParagraph"/>
+        <w:pStyle w:val="BodyText"/>
       </w:pPr>
       <w:r>
         <w:t xml:space="preserve">WHEREFORE, PLAINTIFF PRAYS that, after due proceedings, this Court enter a judgment:</w:t>
@@ -1088,13 +1343,19 @@
       <w:r>
         <w:t xml:space="preserve">for all other legal and equitable relief which Plaintiff may be entitled to receive, including reimbursement for all costs and expenses of prosecuting this adversary proceeding, including all expenses approved by this Court and payment of any expenses, court costs, deposition costs, subpoena fees, witness fees or other expenses incurred in connection with the litigation.</w:t>
       </w:r>
+    </w:p>
+    <w:p>
+      <w:pPr>
+        <w:spacing w:before="0" w:after="0" w:line="480" w:lineRule="exact"/>
+      </w:pPr>
     </w:p>
     <w:p>
       <w:pPr>
         <w:keepNext/>
         <w:keepLines/>
-        <w:spacing w:before="351" w:after="351" w:line="300" w:lineRule="exact"/>
-        <w:ind w:left="4680"/>
+        <w:spacing w:before="0" w:after="0" w:line="280" w:lineRule="exact"/>
+        <w:ind w:left="4680" w:firstLine="0"/>
+        <w:jc w:val="left"/>
       </w:pPr>
       <w:r>
         <w:t xml:space="preserve">Respectfully submitted,</w:t>
@@ -1104,59 +1365,436 @@
       <w:pPr>
         <w:keepNext/>
         <w:keepLines/>
-        <w:spacing w:before="0" w:after="0" w:line="300" w:lineRule="exact"/>
-        <w:ind w:left="4680"/>
-      </w:pPr>
-      <w:r>
-        <w:t xml:space="preserve">WIENER, WEISS &amp; MADISON, APC</w:t>
+        <w:spacing w:before="280" w:after="0" w:line="280" w:lineRule="exact"/>
+        <w:ind w:left="4680" w:firstLine="0"/>
+        <w:jc w:val="left"/>
+      </w:pPr>
+      <w:r>
+        <w:t xml:space="preserve">WIENER,</w:t>
+      </w:r>
+      <w:r>
+        <w:t xml:space="preserve"> </w:t>
+      </w:r>
+      <w:r>
+        <w:t xml:space="preserve">WEISS</w:t>
+      </w:r>
+      <w:r>
+        <w:t xml:space="preserve"> </w:t>
+      </w:r>
+      <w:r>
+        <w:t xml:space="preserve">&amp;</w:t>
+      </w:r>
+      <w:r>
+        <w:t xml:space="preserve"> </w:t>
+      </w:r>
+      <w:r>
+        <w:t xml:space="preserve">MADISON,</w:t>
+      </w:r>
+      <w:r>
+        <w:t xml:space="preserve"> </w:t>
+      </w:r>
+      <w:r>
+        <w:t xml:space="preserve">APC</w:t>
       </w:r>
     </w:p>
     <w:p>
       <w:pPr>
         <w:keepNext/>
         <w:keepLines/>
-        <w:spacing w:before="0" w:after="0" w:line="300" w:lineRule="exact"/>
-        <w:ind w:left="4680"/>
-      </w:pPr>
-      <w:r>
-        <w:t xml:space="preserve">By: /s/ Patrick L. McCune</w:t>
+        <w:spacing w:before="0" w:after="0" w:line="280" w:lineRule="exact"/>
+        <w:ind w:left="4680" w:firstLine="0"/>
+        <w:jc w:val="left"/>
+      </w:pPr>
+      <w:r>
+        <w:t xml:space="preserve">By:</w:t>
+      </w:r>
+      <w:r>
+        <w:t xml:space="preserve"> </w:t>
+      </w:r>
+      <w:r>
+        <w:t xml:space="preserve">/​s/</w:t>
+      </w:r>
+      <w:r>
+        <w:t xml:space="preserve"> </w:t>
+      </w:r>
+      <w:r>
+        <w:t xml:space="preserve">Patrick</w:t>
+      </w:r>
+      <w:r>
+        <w:t xml:space="preserve"> </w:t>
+      </w:r>
+      <w:r>
+        <w:t xml:space="preserve">L.</w:t>
+      </w:r>
+      <w:r>
+        <w:t xml:space="preserve"> </w:t>
+      </w:r>
+      <w:r>
+        <w:t xml:space="preserve">McCune</w:t>
       </w:r>
     </w:p>
     <w:p>
       <w:pPr>
         <w:keepNext/>
         <w:keepLines/>
-        <w:spacing w:before="0" w:after="0" w:line="300" w:lineRule="exact"/>
-        <w:ind w:left="4680"/>
-      </w:pPr>
-      <w:r>
-        <w:t xml:space="preserve">R. Joseph Naus La. Bar No. 17074Patrick L. McCune La. Bar No. 31863Seth M. Moyers La. Bar No. 32607Reid A. Jones La. Bar No. 34611P.O. Box 21990Shreveport, Louisiana 71120-1990Telephone: (318) 226-9100Telecopier: (318) 424-5128</w:t>
+        <w:spacing w:before="0" w:after="0" w:line="280" w:lineRule="exact"/>
+        <w:ind w:left="4680" w:firstLine="0"/>
+        <w:jc w:val="left"/>
+      </w:pPr>
+      <w:r>
+        <w:t xml:space="preserve">R.</w:t>
+      </w:r>
+      <w:r>
+        <w:t xml:space="preserve"> </w:t>
+      </w:r>
+      <w:r>
+        <w:t xml:space="preserve">Joseph</w:t>
+      </w:r>
+      <w:r>
+        <w:t xml:space="preserve"> </w:t>
+      </w:r>
+      <w:r>
+        <w:t xml:space="preserve">Naus</w:t>
+      </w:r>
+      <w:r>
+        <w:t xml:space="preserve"> </w:t>
+      </w:r>
+      <w:r>
+        <w:t xml:space="preserve">La.</w:t>
+      </w:r>
+      <w:r>
+        <w:t xml:space="preserve"> </w:t>
+      </w:r>
+      <w:r>
+        <w:t xml:space="preserve">Bar</w:t>
+      </w:r>
+      <w:r>
+        <w:t xml:space="preserve"> </w:t>
+      </w:r>
+      <w:r>
+        <w:t xml:space="preserve">No.</w:t>
+      </w:r>
+      <w:r>
+        <w:t xml:space="preserve"> </w:t>
+      </w:r>
+      <w:r>
+        <w:t xml:space="preserve">17074</w:t>
       </w:r>
     </w:p>
     <w:p>
       <w:pPr>
         <w:keepNext/>
         <w:keepLines/>
-        <w:spacing w:before="0" w:after="0" w:line="300" w:lineRule="exact"/>
-        <w:ind w:left="4680"/>
-      </w:pPr>
-    </w:p>
-    <w:p>
-      <w:pPr>
+        <w:spacing w:before="0" w:after="0" w:line="280" w:lineRule="exact"/>
+        <w:ind w:left="4680" w:firstLine="0"/>
+        <w:jc w:val="left"/>
+      </w:pPr>
+      <w:r>
+        <w:t xml:space="preserve">Patrick</w:t>
+      </w:r>
+      <w:r>
+        <w:t xml:space="preserve"> </w:t>
+      </w:r>
+      <w:r>
+        <w:t xml:space="preserve">L.</w:t>
+      </w:r>
+      <w:r>
+        <w:t xml:space="preserve"> </w:t>
+      </w:r>
+      <w:r>
+        <w:t xml:space="preserve">McCune</w:t>
+      </w:r>
+      <w:r>
+        <w:t xml:space="preserve"> </w:t>
+      </w:r>
+      <w:r>
+        <w:t xml:space="preserve">La.</w:t>
+      </w:r>
+      <w:r>
+        <w:t xml:space="preserve"> </w:t>
+      </w:r>
+      <w:r>
+        <w:t xml:space="preserve">Bar</w:t>
+      </w:r>
+      <w:r>
+        <w:t xml:space="preserve"> </w:t>
+      </w:r>
+      <w:r>
+        <w:t xml:space="preserve">No.</w:t>
+      </w:r>
+      <w:r>
+        <w:t xml:space="preserve"> </w:t>
+      </w:r>
+      <w:r>
+        <w:t xml:space="preserve">31863</w:t>
+      </w:r>
+    </w:p>
+    <w:p>
+      <w:pPr>
+        <w:keepNext/>
         <w:keepLines/>
-        <w:spacing w:before="0" w:after="0" w:line="300" w:lineRule="exact"/>
-        <w:ind w:left="4680"/>
-      </w:pPr>
-      <w:r>
-        <w:t xml:space="preserve">ATTORNEYS FOR PLAINTIFF,ELIZABETH G. ANDRUS, CHAPTER 7 TRUSTEE</w:t>
-      </w:r>
-    </w:p>
-    <w:bookmarkEnd w:id="26"/>
+        <w:spacing w:before="0" w:after="0" w:line="280" w:lineRule="exact"/>
+        <w:ind w:left="4680" w:firstLine="0"/>
+        <w:jc w:val="left"/>
+      </w:pPr>
+      <w:r>
+        <w:t xml:space="preserve">Seth</w:t>
+      </w:r>
+      <w:r>
+        <w:t xml:space="preserve"> </w:t>
+      </w:r>
+      <w:r>
+        <w:t xml:space="preserve">M.</w:t>
+      </w:r>
+      <w:r>
+        <w:t xml:space="preserve"> </w:t>
+      </w:r>
+      <w:r>
+        <w:t xml:space="preserve">Moyers</w:t>
+      </w:r>
+      <w:r>
+        <w:t xml:space="preserve"> </w:t>
+      </w:r>
+      <w:r>
+        <w:t xml:space="preserve">La.</w:t>
+      </w:r>
+      <w:r>
+        <w:t xml:space="preserve"> </w:t>
+      </w:r>
+      <w:r>
+        <w:t xml:space="preserve">Bar</w:t>
+      </w:r>
+      <w:r>
+        <w:t xml:space="preserve"> </w:t>
+      </w:r>
+      <w:r>
+        <w:t xml:space="preserve">No.</w:t>
+      </w:r>
+      <w:r>
+        <w:t xml:space="preserve"> </w:t>
+      </w:r>
+      <w:r>
+        <w:t xml:space="preserve">32607</w:t>
+      </w:r>
+    </w:p>
+    <w:p>
+      <w:pPr>
+        <w:keepNext/>
+        <w:keepLines/>
+        <w:spacing w:before="0" w:after="0" w:line="280" w:lineRule="exact"/>
+        <w:ind w:left="4680" w:firstLine="0"/>
+        <w:jc w:val="left"/>
+      </w:pPr>
+      <w:r>
+        <w:t xml:space="preserve">Reid</w:t>
+      </w:r>
+      <w:r>
+        <w:t xml:space="preserve"> </w:t>
+      </w:r>
+      <w:r>
+        <w:t xml:space="preserve">A.</w:t>
+      </w:r>
+      <w:r>
+        <w:t xml:space="preserve"> </w:t>
+      </w:r>
+      <w:r>
+        <w:t xml:space="preserve">Jones</w:t>
+      </w:r>
+      <w:r>
+        <w:t xml:space="preserve"> </w:t>
+      </w:r>
+      <w:r>
+        <w:t xml:space="preserve">La.</w:t>
+      </w:r>
+      <w:r>
+        <w:t xml:space="preserve"> </w:t>
+      </w:r>
+      <w:r>
+        <w:t xml:space="preserve">Bar</w:t>
+      </w:r>
+      <w:r>
+        <w:t xml:space="preserve"> </w:t>
+      </w:r>
+      <w:r>
+        <w:t xml:space="preserve">No.</w:t>
+      </w:r>
+      <w:r>
+        <w:t xml:space="preserve"> </w:t>
+      </w:r>
+      <w:r>
+        <w:t xml:space="preserve">34611</w:t>
+      </w:r>
+    </w:p>
+    <w:p>
+      <w:pPr>
+        <w:keepNext/>
+        <w:keepLines/>
+        <w:spacing w:before="0" w:after="0" w:line="280" w:lineRule="exact"/>
+        <w:ind w:left="4680" w:firstLine="0"/>
+        <w:jc w:val="left"/>
+      </w:pPr>
+      <w:r>
+        <w:t xml:space="preserve">P.O.</w:t>
+      </w:r>
+      <w:r>
+        <w:t xml:space="preserve"> </w:t>
+      </w:r>
+      <w:r>
+        <w:t xml:space="preserve">Box</w:t>
+      </w:r>
+      <w:r>
+        <w:t xml:space="preserve"> </w:t>
+      </w:r>
+      <w:r>
+        <w:t xml:space="preserve">21990</w:t>
+      </w:r>
+    </w:p>
+    <w:p>
+      <w:pPr>
+        <w:keepNext/>
+        <w:keepLines/>
+        <w:spacing w:before="0" w:after="0" w:line="280" w:lineRule="exact"/>
+        <w:ind w:left="4680" w:firstLine="0"/>
+        <w:jc w:val="left"/>
+      </w:pPr>
+      <w:r>
+        <w:t xml:space="preserve">Shreveport,</w:t>
+      </w:r>
+      <w:r>
+        <w:t xml:space="preserve"> </w:t>
+      </w:r>
+      <w:r>
+        <w:t xml:space="preserve">Louisiana</w:t>
+      </w:r>
+      <w:r>
+        <w:t xml:space="preserve"> </w:t>
+      </w:r>
+      <w:r>
+        <w:t xml:space="preserve">71120</w:t>
+        <w:noBreakHyphen/>
+        <w:t xml:space="preserve">1990</w:t>
+      </w:r>
+    </w:p>
+    <w:p>
+      <w:pPr>
+        <w:keepNext/>
+        <w:keepLines/>
+        <w:spacing w:before="0" w:after="0" w:line="280" w:lineRule="exact"/>
+        <w:ind w:left="4680" w:firstLine="0"/>
+        <w:jc w:val="left"/>
+      </w:pPr>
+      <w:r>
+        <w:t xml:space="preserve">Telephone:</w:t>
+      </w:r>
+      <w:r>
+        <w:t xml:space="preserve"> </w:t>
+      </w:r>
+      <w:r>
+        <w:t xml:space="preserve">(318)</w:t>
+      </w:r>
+      <w:r>
+        <w:t xml:space="preserve"> </w:t>
+      </w:r>
+      <w:r>
+        <w:t xml:space="preserve">226</w:t>
+        <w:noBreakHyphen/>
+        <w:t xml:space="preserve">9100</w:t>
+      </w:r>
+    </w:p>
+    <w:p>
+      <w:pPr>
+        <w:keepNext/>
+        <w:keepLines/>
+        <w:spacing w:before="0" w:after="0" w:line="280" w:lineRule="exact"/>
+        <w:ind w:left="4680" w:firstLine="0"/>
+        <w:jc w:val="left"/>
+      </w:pPr>
+      <w:r>
+        <w:t xml:space="preserve">Telecopier:</w:t>
+      </w:r>
+      <w:r>
+        <w:t xml:space="preserve"> </w:t>
+      </w:r>
+      <w:r>
+        <w:t xml:space="preserve">(318)</w:t>
+      </w:r>
+      <w:r>
+        <w:t xml:space="preserve"> </w:t>
+      </w:r>
+      <w:r>
+        <w:t xml:space="preserve">424</w:t>
+        <w:noBreakHyphen/>
+        <w:t xml:space="preserve">5128</w:t>
+      </w:r>
+    </w:p>
+    <w:p>
+      <w:pPr>
+        <w:keepNext/>
+        <w:keepLines/>
+        <w:spacing w:before="280" w:after="0" w:line="280" w:lineRule="exact"/>
+        <w:ind w:left="4680" w:firstLine="0"/>
+        <w:jc w:val="left"/>
+      </w:pPr>
+      <w:r>
+        <w:t xml:space="preserve">ATTORNEYS</w:t>
+      </w:r>
+      <w:r>
+        <w:t xml:space="preserve"> </w:t>
+      </w:r>
+      <w:r>
+        <w:t xml:space="preserve">FOR</w:t>
+      </w:r>
+      <w:r>
+        <w:t xml:space="preserve"> </w:t>
+      </w:r>
+      <w:r>
+        <w:t xml:space="preserve">PLAINTIFF,</w:t>
+      </w:r>
+    </w:p>
+    <w:p>
+      <w:pPr>
+        <w:spacing w:before="0" w:after="0" w:line="280" w:lineRule="exact"/>
+        <w:ind w:left="4680" w:firstLine="0"/>
+        <w:jc w:val="left"/>
+      </w:pPr>
+      <w:r>
+        <w:t xml:space="preserve">ELIZABETH</w:t>
+      </w:r>
+      <w:r>
+        <w:t xml:space="preserve"> </w:t>
+      </w:r>
+      <w:r>
+        <w:t xml:space="preserve">G.</w:t>
+      </w:r>
+      <w:r>
+        <w:t xml:space="preserve"> </w:t>
+      </w:r>
+      <w:r>
+        <w:t xml:space="preserve">ANDRUS,</w:t>
+      </w:r>
+      <w:r>
+        <w:t xml:space="preserve"> </w:t>
+      </w:r>
+      <w:r>
+        <w:t xml:space="preserve">CHAPTER</w:t>
+      </w:r>
+      <w:r>
+        <w:t xml:space="preserve"> </w:t>
+      </w:r>
+      <w:r>
+        <w:t xml:space="preserve">7</w:t>
+      </w:r>
+      <w:r>
+        <w:t xml:space="preserve"> </w:t>
+      </w:r>
+      <w:r>
+        <w:t xml:space="preserve">TRUSTEE</w:t>
+      </w:r>
+    </w:p>
     <w:sectPr>
-      <w:footerReference r:id="rId9" w:type="default"/>
-      <w:pgSz w:h="15840" w:w="12240"/>
-      <w:pgMar w:bottom="1440" w:footer="720" w:gutter="0" w:header="720" w:left="1440" w:right="1440" w:top="1440"/>
-      <w:cols w:space="720"/>
+      <w:footerReference w:type="default" r:id="rIdFooter1"/>
+      <w:pgSz w:w="12240" w:h="15840"/>
+      <w:pgMar w:top="1440" w:right="1440" w:bottom="1440" w:left="1440" w:header="720" w:footer="432" w:gutter="0"/>
     </w:sectPr>
   </w:body>
 </w:document>
@@ -1170,14 +1808,23 @@
 <w:ftr xmlns:w="http://schemas.openxmlformats.org/wordprocessingml/2006/main" xmlns:r="http://schemas.openxmlformats.org/officeDocument/2006/relationships">
   <w:p>
     <w:pPr>
-      <w:spacing w:before="0" w:after="0" w:line="240" w:lineRule="auto"/>
       <w:jc w:val="center"/>
     </w:pPr>
-    <w:fldSimple w:instr=" PAGE ">
-      <w:r>
-        <w:t>1</w:t>
-      </w:r>
-    </w:fldSimple>
+    <w:r>
+      <w:fldChar w:fldCharType="begin"/>
+    </w:r>
+    <w:r>
+      <w:instrText xml:space="preserve"> PAGE </w:instrText>
+    </w:r>
+    <w:r>
+      <w:fldChar w:fldCharType="separate"/>
+    </w:r>
+    <w:r>
+      <w:t>1</w:t>
+    </w:r>
+    <w:r>
+      <w:fldChar w:fldCharType="end"/>
+    </w:r>
   </w:p>
 </w:ftr>
 </file>
@@ -1290,20 +1937,49 @@
   <w:docDefaults>
     <w:rPrDefault>
       <w:rPr>
-        <w:rFonts w:ascii="EB Garamond" w:cs="EB Garamond" w:eastAsia="EB Garamond" w:hAnsi="EB Garamond"/>
-        <w:sz w:val="26"/>
-        <w:szCs w:val="26"/>
-        <w:lang w:bidi="ar-SA" w:eastAsia="en-US" w:val="en-US"/>
+        <w:rFonts w:ascii="Times New Roman" w:hAnsi="Times New Roman" w:eastAsia="Times New Roman" w:cs="Times New Roman"/>
+        <w:sz w:val="24"/>
+        <w:szCs w:val="24"/>
+        <w:lang w:val="en-US" w:eastAsia="zh-CN" w:bidi="ar-SA"/>
       </w:rPr>
     </w:rPrDefault>
     <w:pPrDefault>
       <w:pPr>
-        <w:spacing w:after="0" w:line="240" w:lineRule="auto"/>
+        <w:widowControl/>
+        <w:spacing w:after="0"/>
       </w:pPr>
     </w:pPrDefault>
   </w:docDefaults>
-  <w:latentStyles w:count="276" w:defLockedState="0" w:defQFormat="0" w:defSemiHidden="0" w:defUIPriority="0" w:defUnhideWhenUsed="0"/>
-  <w:style w:styleId="Title" w:type="paragraph">
+  <w:latentStyles w:defLockedState="0" w:defUIPriority="0" w:defSemiHidden="0" w:defUnhideWhenUsed="0" w:defQFormat="0" w:count="276"/>
+  <w:style w:type="paragraph" w:default="1" w:styleId="Normal">
+    <w:name w:val="Normal"/>
+    <w:qFormat/>
+  </w:style>
+  <w:style w:type="paragraph" w:styleId="BodyText">
+    <w:name w:val="Body Text"/>
+    <w:basedOn w:val="Normal"/>
+    <w:link w:val="BodyTextChar"/>
+    <w:qFormat/>
+    <w:pPr>
+      <w:spacing w:before="0" w:after="0" w:line="480" w:lineRule="exact"/>
+      <w:ind w:firstLine="720"/>
+    </w:pPr>
+  </w:style>
+  <w:style w:type="paragraph" w:customStyle="1" w:styleId="FirstParagraph">
+    <w:name w:val="First Paragraph"/>
+    <w:basedOn w:val="BodyText"/>
+    <w:next w:val="BodyText"/>
+    <w:qFormat/>
+  </w:style>
+  <w:style w:type="paragraph" w:customStyle="1" w:styleId="Compact">
+    <w:name w:val="Compact"/>
+    <w:basedOn w:val="BodyText"/>
+    <w:qFormat/>
+    <w:pPr>
+      <w:spacing w:before="36" w:after="36"/>
+    </w:pPr>
+  </w:style>
+  <w:style w:type="paragraph" w:styleId="Title">
     <w:name w:val="Title"/>
     <w:basedOn w:val="Normal"/>
     <w:next w:val="BodyText"/>
@@ -1317,24 +1993,24 @@
       <w:jc w:val="center"/>
     </w:pPr>
     <w:rPr>
-      <w:rFonts w:asciiTheme="majorHAnsi" w:cstheme="majorBidi" w:eastAsiaTheme="majorEastAsia" w:hAnsiTheme="majorHAnsi"/>
+      <w:rFonts w:asciiTheme="majorHAnsi" w:eastAsiaTheme="majorEastAsia" w:hAnsiTheme="majorHAnsi" w:cstheme="majorBidi"/>
       <w:sz w:val="56"/>
       <w:szCs w:val="56"/>
     </w:rPr>
   </w:style>
-  <w:style w:customStyle="1" w:styleId="TitleChar" w:type="character">
+  <w:style w:type="character" w:customStyle="1" w:styleId="TitleChar">
     <w:name w:val="Title Char"/>
     <w:basedOn w:val="DefaultParagraphFont"/>
     <w:link w:val="Title"/>
     <w:uiPriority w:val="10"/>
     <w:rsid w:val="00A10FD9"/>
     <w:rPr>
-      <w:rFonts w:asciiTheme="majorHAnsi" w:cstheme="majorBidi" w:eastAsiaTheme="majorEastAsia" w:hAnsiTheme="majorHAnsi"/>
+      <w:rFonts w:asciiTheme="majorHAnsi" w:eastAsiaTheme="majorEastAsia" w:hAnsiTheme="majorHAnsi" w:cstheme="majorBidi"/>
       <w:sz w:val="56"/>
       <w:szCs w:val="56"/>
     </w:rPr>
   </w:style>
-  <w:style w:styleId="Subtitle" w:type="paragraph">
+  <w:style w:type="paragraph" w:styleId="Subtitle">
     <w:name w:val="Subtitle"/>
     <w:basedOn w:val="Title"/>
     <w:next w:val="BodyText"/>
@@ -1348,27 +2024,27 @@
       </w:numPr>
     </w:pPr>
     <w:rPr>
-      <w:rFonts w:cstheme="majorBidi" w:eastAsiaTheme="majorEastAsia"/>
+      <w:rFonts w:eastAsiaTheme="majorEastAsia" w:cstheme="majorBidi"/>
       <w:spacing w:val="15"/>
       <w:sz w:val="28"/>
       <w:szCs w:val="28"/>
     </w:rPr>
   </w:style>
-  <w:style w:customStyle="1" w:styleId="SubtitleChar" w:type="character">
+  <w:style w:type="character" w:customStyle="1" w:styleId="SubtitleChar">
     <w:name w:val="Subtitle Char"/>
     <w:basedOn w:val="DefaultParagraphFont"/>
     <w:link w:val="Subtitle"/>
     <w:uiPriority w:val="11"/>
     <w:rsid w:val="00A10FD9"/>
     <w:rPr>
-      <w:rFonts w:cstheme="majorBidi" w:eastAsiaTheme="majorEastAsia"/>
-      <w:color w:themeColor="text1" w:themeTint="A6" w:val="595959"/>
+      <w:rFonts w:eastAsiaTheme="majorEastAsia" w:cstheme="majorBidi"/>
+      <w:color w:val="595959" w:themeColor="text1" w:themeTint="A6"/>
       <w:spacing w:val="15"/>
       <w:sz w:val="28"/>
       <w:szCs w:val="28"/>
     </w:rPr>
   </w:style>
-  <w:style w:customStyle="1" w:styleId="Author" w:type="paragraph">
+  <w:style w:type="paragraph" w:customStyle="1" w:styleId="Author">
     <w:name w:val="Author"/>
     <w:basedOn w:val="Title"/>
     <w:next w:val="BodyText"/>
@@ -1382,7 +2058,7 @@
       <w:szCs w:val="24"/>
     </w:rPr>
   </w:style>
-  <w:style w:styleId="Date" w:type="paragraph">
+  <w:style w:type="paragraph" w:styleId="Date">
     <w:name w:val="Date"/>
     <w:basedOn w:val="Title"/>
     <w:next w:val="BodyText"/>
@@ -1396,7 +2072,7 @@
       <w:szCs w:val="24"/>
     </w:rPr>
   </w:style>
-  <w:style w:customStyle="1" w:styleId="AbstractTitle" w:type="paragraph">
+  <w:style w:type="paragraph" w:customStyle="1" w:styleId="AbstractTitle">
     <w:name w:val="Abstract Title"/>
     <w:basedOn w:val="Normal"/>
     <w:next w:val="Abstract"/>
@@ -1404,7 +2080,7 @@
     <w:pPr>
       <w:keepNext/>
       <w:keepLines/>
-      <w:spacing w:after="0" w:before="300"/>
+      <w:spacing w:before="300" w:after="0"/>
       <w:jc w:val="center"/>
     </w:pPr>
     <w:rPr>
@@ -1413,7 +2089,7 @@
       <w:szCs w:val="20"/>
     </w:rPr>
   </w:style>
-  <w:style w:customStyle="1" w:styleId="Abstract" w:type="paragraph">
+  <w:style w:type="paragraph" w:customStyle="1" w:styleId="Abstract">
     <w:name w:val="Abstract"/>
     <w:basedOn w:val="Normal"/>
     <w:next w:val="BodyText"/>
@@ -1421,14 +2097,14 @@
     <w:pPr>
       <w:keepNext/>
       <w:keepLines/>
-      <w:spacing w:after="300" w:before="100"/>
+      <w:spacing w:before="100" w:after="300"/>
     </w:pPr>
     <w:rPr>
       <w:sz w:val="20"/>
       <w:szCs w:val="20"/>
     </w:rPr>
   </w:style>
-  <w:style w:styleId="Bibliography" w:type="paragraph">
+  <w:style w:type="paragraph" w:styleId="Bibliography">
     <w:name w:val="Bibliography"/>
     <w:basedOn w:val="Normal"/>
     <w:next w:val="Bibliography"/>
@@ -1436,7 +2112,50 @@
     <w:pPr/>
     <w:rPr/>
   </w:style>
-  <w:style w:styleId="Heading3" w:type="paragraph">
+  <w:style w:type="paragraph" w:styleId="Heading1">
+    <w:name w:val="heading 1"/>
+    <w:basedOn w:val="Normal"/>
+    <w:next w:val="BodyText"/>
+    <w:qFormat/>
+    <w:pPr>
+      <w:keepNext/>
+      <w:keepLines/>
+      <w:spacing w:before="240" w:after="240" w:line="480" w:lineRule="exact"/>
+      <w:ind w:firstLine="0"/>
+      <w:jc w:val="center"/>
+      <w:outlineLvl w:val="0"/>
+    </w:pPr>
+    <w:rPr>
+      <w:b/>
+      <w:bCs/>
+      <w:u w:val="single"/>
+      <w:color w:val="000000"/>
+      <w:sz w:val="24"/>
+      <w:szCs w:val="24"/>
+    </w:rPr>
+  </w:style>
+  <w:style w:type="paragraph" w:styleId="Heading2">
+    <w:name w:val="heading 2"/>
+    <w:basedOn w:val="Normal"/>
+    <w:next w:val="BodyText"/>
+    <w:qFormat/>
+    <w:pPr>
+      <w:keepNext/>
+      <w:keepLines/>
+      <w:spacing w:before="240" w:after="240" w:line="480" w:lineRule="exact"/>
+      <w:ind w:firstLine="0"/>
+      <w:jc w:val="center"/>
+      <w:outlineLvl w:val="1"/>
+    </w:pPr>
+    <w:rPr>
+      <w:b/>
+      <w:bCs/>
+      <w:color w:val="000000"/>
+      <w:sz w:val="24"/>
+      <w:szCs w:val="24"/>
+    </w:rPr>
+  </w:style>
+  <w:style w:type="paragraph" w:styleId="Heading3">
     <w:name w:val="heading 3"/>
     <w:basedOn w:val="Normal"/>
     <w:next w:val="BodyText"/>
@@ -1449,17 +2168,20 @@
     <w:pPr>
       <w:keepNext/>
       <w:keepLines/>
-      <w:spacing w:after="80" w:before="160"/>
+      <w:spacing w:before="240" w:after="120" w:line="280" w:lineRule="exact"/>
+      <w:ind w:firstLine="0"/>
       <w:outlineLvl w:val="2"/>
     </w:pPr>
     <w:rPr>
-      <w:rFonts w:cstheme="majorBidi" w:eastAsiaTheme="majorEastAsia"/>
-      <w:color w:themeColor="accent1" w:themeShade="BF" w:val="0F4761"/>
-      <w:sz w:val="28"/>
-      <w:szCs w:val="28"/>
-    </w:rPr>
-  </w:style>
-  <w:style w:styleId="Heading4" w:type="paragraph">
+      <w:rFonts w:ascii="Times New Roman" w:hAnsi="Times New Roman" w:eastAsia="Times New Roman" w:cs="Times New Roman"/>
+      <w:b/>
+      <w:bCs/>
+      <w:color w:val="000000"/>
+      <w:sz w:val="24"/>
+      <w:szCs w:val="24"/>
+    </w:rPr>
+  </w:style>
+  <w:style w:type="paragraph" w:styleId="Heading4">
     <w:name w:val="heading 4"/>
     <w:basedOn w:val="Normal"/>
     <w:next w:val="BodyText"/>
@@ -1472,17 +2194,21 @@
     <w:pPr>
       <w:keepNext/>
       <w:keepLines/>
-      <w:spacing w:after="40" w:before="80"/>
+      <w:spacing w:before="240" w:after="120" w:line="280" w:lineRule="exact"/>
+      <w:ind w:firstLine="0"/>
       <w:outlineLvl w:val="3"/>
     </w:pPr>
     <w:rPr>
-      <w:rFonts w:cstheme="majorBidi" w:eastAsiaTheme="majorEastAsia"/>
+      <w:rFonts w:ascii="Times New Roman" w:hAnsi="Times New Roman" w:eastAsia="Times New Roman" w:cs="Times New Roman"/>
+      <w:b/>
+      <w:bCs/>
       <w:i/>
-      <w:iCs/>
-      <w:color w:themeColor="accent1" w:themeShade="BF" w:val="0F4761"/>
-    </w:rPr>
-  </w:style>
-  <w:style w:styleId="Heading5" w:type="paragraph">
+      <w:color w:val="000000"/>
+      <w:sz w:val="24"/>
+      <w:szCs w:val="24"/>
+    </w:rPr>
+  </w:style>
+  <w:style w:type="paragraph" w:styleId="Heading5">
     <w:name w:val="heading 5"/>
     <w:basedOn w:val="Normal"/>
     <w:next w:val="BodyText"/>
@@ -1495,15 +2221,21 @@
     <w:pPr>
       <w:keepNext/>
       <w:keepLines/>
-      <w:spacing w:after="40" w:before="80"/>
+      <w:spacing w:before="240" w:after="120" w:line="280" w:lineRule="exact"/>
+      <w:ind w:firstLine="0"/>
       <w:outlineLvl w:val="4"/>
     </w:pPr>
     <w:rPr>
-      <w:rFonts w:cstheme="majorBidi" w:eastAsiaTheme="majorEastAsia"/>
-      <w:color w:themeColor="accent1" w:themeShade="BF" w:val="0F4761"/>
-    </w:rPr>
-  </w:style>
-  <w:style w:styleId="Heading6" w:type="paragraph">
+      <w:rFonts w:ascii="Times New Roman" w:hAnsi="Times New Roman" w:eastAsia="Times New Roman" w:cs="Times New Roman"/>
+      <w:b/>
+      <w:bCs/>
+      <w:i/>
+      <w:color w:val="000000"/>
+      <w:sz w:val="24"/>
+      <w:szCs w:val="24"/>
+    </w:rPr>
+  </w:style>
+  <w:style w:type="paragraph" w:styleId="Heading6">
     <w:name w:val="heading 6"/>
     <w:basedOn w:val="Normal"/>
     <w:next w:val="BodyText"/>
@@ -1516,17 +2248,17 @@
     <w:pPr>
       <w:keepNext/>
       <w:keepLines/>
-      <w:spacing w:after="0" w:before="40"/>
+      <w:spacing w:before="40" w:after="0"/>
       <w:outlineLvl w:val="5"/>
     </w:pPr>
     <w:rPr>
-      <w:rFonts w:cstheme="majorBidi" w:eastAsiaTheme="majorEastAsia"/>
+      <w:rFonts w:eastAsiaTheme="majorEastAsia" w:cstheme="majorBidi"/>
       <w:i/>
       <w:iCs/>
-      <w:color w:themeColor="text1" w:themeTint="A6" w:val="595959"/>
-    </w:rPr>
-  </w:style>
-  <w:style w:styleId="Heading7" w:type="paragraph">
+      <w:color w:val="595959" w:themeColor="text1" w:themeTint="A6"/>
+    </w:rPr>
+  </w:style>
+  <w:style w:type="paragraph" w:styleId="Heading7">
     <w:name w:val="heading 7"/>
     <w:basedOn w:val="Normal"/>
     <w:next w:val="BodyText"/>
@@ -1539,15 +2271,15 @@
     <w:pPr>
       <w:keepNext/>
       <w:keepLines/>
-      <w:spacing w:after="0" w:before="40"/>
+      <w:spacing w:before="40" w:after="0"/>
       <w:outlineLvl w:val="6"/>
     </w:pPr>
     <w:rPr>
-      <w:rFonts w:cstheme="majorBidi" w:eastAsiaTheme="majorEastAsia"/>
-      <w:color w:themeColor="text1" w:themeTint="A6" w:val="595959"/>
-    </w:rPr>
-  </w:style>
-  <w:style w:styleId="Heading8" w:type="paragraph">
+      <w:rFonts w:eastAsiaTheme="majorEastAsia" w:cstheme="majorBidi"/>
+      <w:color w:val="595959" w:themeColor="text1" w:themeTint="A6"/>
+    </w:rPr>
+  </w:style>
+  <w:style w:type="paragraph" w:styleId="Heading8">
     <w:name w:val="heading 8"/>
     <w:basedOn w:val="Normal"/>
     <w:next w:val="BodyText"/>
@@ -1564,13 +2296,13 @@
       <w:outlineLvl w:val="7"/>
     </w:pPr>
     <w:rPr>
-      <w:rFonts w:cstheme="majorBidi" w:eastAsiaTheme="majorEastAsia"/>
+      <w:rFonts w:eastAsiaTheme="majorEastAsia" w:cstheme="majorBidi"/>
       <w:i/>
       <w:iCs/>
-      <w:color w:themeColor="text1" w:themeTint="D8" w:val="272727"/>
-    </w:rPr>
-  </w:style>
-  <w:style w:styleId="Heading9" w:type="paragraph">
+      <w:color w:val="272727" w:themeColor="text1" w:themeTint="D8"/>
+    </w:rPr>
+  </w:style>
+  <w:style w:type="paragraph" w:styleId="Heading9">
     <w:name w:val="heading 9"/>
     <w:basedOn w:val="Normal"/>
     <w:next w:val="BodyText"/>
@@ -1587,24 +2319,24 @@
       <w:outlineLvl w:val="8"/>
     </w:pPr>
     <w:rPr>
-      <w:rFonts w:cstheme="majorBidi" w:eastAsiaTheme="majorEastAsia"/>
-      <w:color w:themeColor="text1" w:themeTint="D8" w:val="272727"/>
-    </w:rPr>
-  </w:style>
-  <w:style w:customStyle="1" w:styleId="Heading1Char" w:type="character">
+      <w:rFonts w:eastAsiaTheme="majorEastAsia" w:cstheme="majorBidi"/>
+      <w:color w:val="272727" w:themeColor="text1" w:themeTint="D8"/>
+    </w:rPr>
+  </w:style>
+  <w:style w:type="character" w:customStyle="1" w:styleId="Heading1Char">
     <w:name w:val="Heading 1 Char"/>
     <w:basedOn w:val="DefaultParagraphFont"/>
     <w:link w:val="Heading1"/>
     <w:uiPriority w:val="9"/>
     <w:rsid w:val="00A10FD9"/>
     <w:rPr>
-      <w:rFonts w:asciiTheme="majorHAnsi" w:cstheme="majorBidi" w:eastAsiaTheme="majorEastAsia" w:hAnsiTheme="majorHAnsi"/>
-      <w:color w:themeColor="accent1" w:themeShade="BF" w:val="0F4761"/>
+      <w:rFonts w:asciiTheme="majorHAnsi" w:eastAsiaTheme="majorEastAsia" w:hAnsiTheme="majorHAnsi" w:cstheme="majorBidi"/>
+      <w:color w:val="0F4761" w:themeColor="accent1" w:themeShade="BF"/>
       <w:sz w:val="40"/>
       <w:szCs w:val="40"/>
     </w:rPr>
   </w:style>
-  <w:style w:customStyle="1" w:styleId="Heading2Char" w:type="character">
+  <w:style w:type="character" w:customStyle="1" w:styleId="Heading2Char">
     <w:name w:val="Heading 2 Char"/>
     <w:basedOn w:val="DefaultParagraphFont"/>
     <w:link w:val="Heading2"/>
@@ -1612,13 +2344,13 @@
     <w:semiHidden/>
     <w:rsid w:val="00A10FD9"/>
     <w:rPr>
-      <w:rFonts w:asciiTheme="majorHAnsi" w:cstheme="majorBidi" w:eastAsiaTheme="majorEastAsia" w:hAnsiTheme="majorHAnsi"/>
-      <w:color w:themeColor="accent1" w:themeShade="BF" w:val="0F4761"/>
+      <w:rFonts w:asciiTheme="majorHAnsi" w:eastAsiaTheme="majorEastAsia" w:hAnsiTheme="majorHAnsi" w:cstheme="majorBidi"/>
+      <w:color w:val="0F4761" w:themeColor="accent1" w:themeShade="BF"/>
       <w:sz w:val="32"/>
       <w:szCs w:val="32"/>
     </w:rPr>
   </w:style>
-  <w:style w:customStyle="1" w:styleId="Heading3Char" w:type="character">
+  <w:style w:type="character" w:customStyle="1" w:styleId="Heading3Char">
     <w:name w:val="Heading 3 Char"/>
     <w:basedOn w:val="DefaultParagraphFont"/>
     <w:link w:val="Heading3"/>
@@ -1626,13 +2358,13 @@
     <w:semiHidden/>
     <w:rsid w:val="00A10FD9"/>
     <w:rPr>
-      <w:rFonts w:cstheme="majorBidi" w:eastAsiaTheme="majorEastAsia"/>
-      <w:color w:themeColor="accent1" w:themeShade="BF" w:val="0F4761"/>
+      <w:rFonts w:eastAsiaTheme="majorEastAsia" w:cstheme="majorBidi"/>
+      <w:color w:val="0F4761" w:themeColor="accent1" w:themeShade="BF"/>
       <w:sz w:val="28"/>
       <w:szCs w:val="28"/>
     </w:rPr>
   </w:style>
-  <w:style w:customStyle="1" w:styleId="Heading4Char" w:type="character">
+  <w:style w:type="character" w:customStyle="1" w:styleId="Heading4Char">
     <w:name w:val="Heading 4 Char"/>
     <w:basedOn w:val="DefaultParagraphFont"/>
     <w:link w:val="Heading4"/>
@@ -1640,13 +2372,13 @@
     <w:semiHidden/>
     <w:rsid w:val="00A10FD9"/>
     <w:rPr>
-      <w:rFonts w:cstheme="majorBidi" w:eastAsiaTheme="majorEastAsia"/>
+      <w:rFonts w:eastAsiaTheme="majorEastAsia" w:cstheme="majorBidi"/>
       <w:i/>
       <w:iCs/>
-      <w:color w:themeColor="accent1" w:themeShade="BF" w:val="0F4761"/>
-    </w:rPr>
-  </w:style>
-  <w:style w:customStyle="1" w:styleId="Heading5Char" w:type="character">
+      <w:color w:val="0F4761" w:themeColor="accent1" w:themeShade="BF"/>
+    </w:rPr>
+  </w:style>
+  <w:style w:type="character" w:customStyle="1" w:styleId="Heading5Char">
     <w:name w:val="Heading 5 Char"/>
     <w:basedOn w:val="DefaultParagraphFont"/>
     <w:link w:val="Heading5"/>
@@ -1654,11 +2386,11 @@
     <w:semiHidden/>
     <w:rsid w:val="00A10FD9"/>
     <w:rPr>
-      <w:rFonts w:cstheme="majorBidi" w:eastAsiaTheme="majorEastAsia"/>
-      <w:color w:themeColor="accent1" w:themeShade="BF" w:val="0F4761"/>
-    </w:rPr>
-  </w:style>
-  <w:style w:customStyle="1" w:styleId="Heading6Char" w:type="character">
+      <w:rFonts w:eastAsiaTheme="majorEastAsia" w:cstheme="majorBidi"/>
+      <w:color w:val="0F4761" w:themeColor="accent1" w:themeShade="BF"/>
+    </w:rPr>
+  </w:style>
+  <w:style w:type="character" w:customStyle="1" w:styleId="Heading6Char">
     <w:name w:val="Heading 6 Char"/>
     <w:basedOn w:val="DefaultParagraphFont"/>
     <w:link w:val="Heading6"/>
@@ -1666,13 +2398,13 @@
     <w:semiHidden/>
     <w:rsid w:val="00A10FD9"/>
     <w:rPr>
-      <w:rFonts w:cstheme="majorBidi" w:eastAsiaTheme="majorEastAsia"/>
+      <w:rFonts w:eastAsiaTheme="majorEastAsia" w:cstheme="majorBidi"/>
       <w:i/>
       <w:iCs/>
-      <w:color w:themeColor="text1" w:themeTint="A6" w:val="595959"/>
-    </w:rPr>
-  </w:style>
-  <w:style w:customStyle="1" w:styleId="Heading7Char" w:type="character">
+      <w:color w:val="595959" w:themeColor="text1" w:themeTint="A6"/>
+    </w:rPr>
+  </w:style>
+  <w:style w:type="character" w:customStyle="1" w:styleId="Heading7Char">
     <w:name w:val="Heading 7 Char"/>
     <w:basedOn w:val="DefaultParagraphFont"/>
     <w:link w:val="Heading7"/>
@@ -1680,11 +2412,11 @@
     <w:semiHidden/>
     <w:rsid w:val="00A10FD9"/>
     <w:rPr>
-      <w:rFonts w:cstheme="majorBidi" w:eastAsiaTheme="majorEastAsia"/>
-      <w:color w:themeColor="text1" w:themeTint="A6" w:val="595959"/>
-    </w:rPr>
-  </w:style>
-  <w:style w:customStyle="1" w:styleId="Heading8Char" w:type="character">
+      <w:rFonts w:eastAsiaTheme="majorEastAsia" w:cstheme="majorBidi"/>
+      <w:color w:val="595959" w:themeColor="text1" w:themeTint="A6"/>
+    </w:rPr>
+  </w:style>
+  <w:style w:type="character" w:customStyle="1" w:styleId="Heading8Char">
     <w:name w:val="Heading 8 Char"/>
     <w:basedOn w:val="DefaultParagraphFont"/>
     <w:link w:val="Heading8"/>
@@ -1692,13 +2424,13 @@
     <w:semiHidden/>
     <w:rsid w:val="00A10FD9"/>
     <w:rPr>
-      <w:rFonts w:cstheme="majorBidi" w:eastAsiaTheme="majorEastAsia"/>
+      <w:rFonts w:eastAsiaTheme="majorEastAsia" w:cstheme="majorBidi"/>
       <w:i/>
       <w:iCs/>
-      <w:color w:themeColor="text1" w:themeTint="D8" w:val="272727"/>
-    </w:rPr>
-  </w:style>
-  <w:style w:customStyle="1" w:styleId="Heading9Char" w:type="character">
+      <w:color w:val="272727" w:themeColor="text1" w:themeTint="D8"/>
+    </w:rPr>
+  </w:style>
+  <w:style w:type="character" w:customStyle="1" w:styleId="Heading9Char">
     <w:name w:val="Heading 9 Char"/>
     <w:basedOn w:val="DefaultParagraphFont"/>
     <w:link w:val="Heading9"/>
@@ -1706,11 +2438,48 @@
     <w:semiHidden/>
     <w:rsid w:val="00A10FD9"/>
     <w:rPr>
-      <w:rFonts w:cstheme="majorBidi" w:eastAsiaTheme="majorEastAsia"/>
-      <w:color w:themeColor="text1" w:themeTint="D8" w:val="272727"/>
-    </w:rPr>
-  </w:style>
-  <w:style w:styleId="FootnoteBlockText" w:type="paragraph">
+      <w:rFonts w:eastAsiaTheme="majorEastAsia" w:cstheme="majorBidi"/>
+      <w:color w:val="272727" w:themeColor="text1" w:themeTint="D8"/>
+    </w:rPr>
+  </w:style>
+  <w:style w:type="paragraph" w:customStyle="1" w:styleId="ListItem">
+    <w:name w:val="List Item"/>
+    <w:basedOn w:val="BodyText"/>
+    <w:qFormat/>
+    <w:pPr>
+      <w:spacing w:before="0" w:after="0" w:line="480" w:lineRule="exact"/>
+      <w:ind w:left="720" w:hanging="720"/>
+    </w:pPr>
+  </w:style>
+  <w:style w:type="paragraph" w:styleId="BlockText">
+    <w:name w:val="Block Text"/>
+    <w:basedOn w:val="BodyText"/>
+    <w:next w:val="BodyText"/>
+    <w:uiPriority w:val="9"/>
+    <w:unhideWhenUsed/>
+    <w:qFormat/>
+    <w:pPr>
+      <w:spacing w:before="280" w:after="280" w:line="280" w:lineRule="exact"/>
+      <w:ind w:firstLine="0" w:left="720" w:right="720"/>
+    </w:pPr>
+  </w:style>
+  <w:style w:type="paragraph" w:styleId="FootnoteText">
+    <w:name w:val="Footnote Text"/>
+    <w:basedOn w:val="Normal"/>
+    <w:next w:val="FootnoteText"/>
+    <w:uiPriority w:val="9"/>
+    <w:unhideWhenUsed/>
+    <w:qFormat/>
+    <w:pPr>
+      <w:keepLines/>
+      <w:spacing w:before="0" w:after="140" w:line="280" w:lineRule="exact"/>
+    </w:pPr>
+    <w:rPr>
+      <w:sz w:val="24"/>
+      <w:szCs w:val="24"/>
+    </w:rPr>
+  </w:style>
+  <w:style w:type="paragraph" w:styleId="FootnoteBlockText">
     <w:name w:val="Footnote Block Text"/>
     <w:basedOn w:val="FootnoteText"/>
     <w:next w:val="FootnoteText"/>
@@ -1718,16 +2487,38 @@
     <w:unhideWhenUsed/>
     <w:qFormat/>
     <w:pPr>
-      <w:spacing w:after="100" w:before="100"/>
-      <w:ind w:firstLine="0" w:left="480" w:right="480"/>
+      <w:spacing w:before="280" w:after="280"/>
+      <w:ind w:firstLine="0" w:left="720" w:right="720"/>
     </w:pPr>
   </w:style>
-  <w:style w:default="1" w:styleId="DefaultParagraphFont" w:type="character">
+  <w:style w:type="character" w:default="1" w:styleId="DefaultParagraphFont">
     <w:name w:val="Default Paragraph Font"/>
     <w:semiHidden/>
     <w:unhideWhenUsed/>
   </w:style>
-  <w:style w:customStyle="1" w:styleId="DefinitionTerm" w:type="paragraph">
+  <w:style w:type="table" w:default="1" w:styleId="Table">
+    <w:name w:val="Table"/>
+    <w:basedOn w:val="TableNormal"/>
+    <w:qFormat/>
+    <w:tblPr>
+      <w:tblInd w:w="0" w:type="dxa"/>
+      <w:tblCellMar>
+        <w:top w:w="0" w:type="dxa"/>
+        <w:left w:w="108" w:type="dxa"/>
+        <w:bottom w:w="0" w:type="dxa"/>
+        <w:right w:w="108" w:type="dxa"/>
+      </w:tblCellMar>
+    </w:tblPr>
+    <w:tblStylePr w:type="firstRow">
+      <w:tcPr>
+        <w:tcBorders>
+          <w:bottom w:val="single"/>
+        </w:tcBorders>
+        <w:vAlign w:val="bottom"/>
+      </w:tcPr>
+    </w:tblStylePr>
+  </w:style>
+  <w:style w:type="paragraph" w:customStyle="1" w:styleId="DefinitionTerm">
     <w:name w:val="Definition Term"/>
     <w:basedOn w:val="Normal"/>
     <w:next w:val="Definition"/>
@@ -1740,49 +2531,49 @@
       <w:b/>
     </w:rPr>
   </w:style>
-  <w:style w:customStyle="1" w:styleId="Definition" w:type="paragraph">
+  <w:style w:type="paragraph" w:customStyle="1" w:styleId="Definition">
     <w:name w:val="Definition"/>
     <w:basedOn w:val="Normal"/>
   </w:style>
-  <w:style w:styleId="Caption" w:type="paragraph">
+  <w:style w:type="paragraph" w:styleId="Caption">
     <w:name w:val="Caption"/>
     <w:basedOn w:val="Normal"/>
     <w:link w:val="BodyTextChar"/>
     <w:pPr>
-      <w:spacing w:after="120" w:before="0"/>
+      <w:spacing w:before="0" w:after="120"/>
     </w:pPr>
     <w:rPr>
       <w:i/>
     </w:rPr>
   </w:style>
-  <w:style w:customStyle="1" w:styleId="TableCaption" w:type="paragraph">
+  <w:style w:type="paragraph" w:customStyle="1" w:styleId="TableCaption">
     <w:name w:val="Table Caption"/>
     <w:basedOn w:val="Caption"/>
     <w:pPr>
       <w:keepNext/>
     </w:pPr>
   </w:style>
-  <w:style w:customStyle="1" w:styleId="ImageCaption" w:type="paragraph">
+  <w:style w:type="paragraph" w:customStyle="1" w:styleId="ImageCaption">
     <w:name w:val="Image Caption"/>
     <w:basedOn w:val="Caption"/>
   </w:style>
-  <w:style w:customStyle="1" w:styleId="Figure" w:type="paragraph">
+  <w:style w:type="paragraph" w:customStyle="1" w:styleId="Figure">
     <w:name w:val="Figure"/>
     <w:basedOn w:val="Normal"/>
   </w:style>
-  <w:style w:customStyle="1" w:styleId="CaptionedFigure" w:type="paragraph">
+  <w:style w:type="paragraph" w:customStyle="1" w:styleId="CaptionedFigure">
     <w:name w:val="Captioned Figure"/>
     <w:basedOn w:val="Figure"/>
     <w:pPr>
       <w:keepNext/>
     </w:pPr>
   </w:style>
-  <w:style w:customStyle="1" w:styleId="BodyTextChar" w:type="character">
+  <w:style w:type="character" w:customStyle="1" w:styleId="BodyTextChar">
     <w:name w:val="Body Text Char"/>
     <w:basedOn w:val="DefaultParagraphFont"/>
     <w:link w:val="BodyText"/>
   </w:style>
-  <w:style w:customStyle="1" w:styleId="VerbatimChar" w:type="character">
+  <w:style w:type="character" w:customStyle="1" w:styleId="VerbatimChar">
     <w:name w:val="Verbatim Char"/>
     <w:basedOn w:val="BodyTextChar"/>
     <w:rPr>
@@ -1790,25 +2581,25 @@
       <w:sz w:val="22"/>
     </w:rPr>
   </w:style>
-  <w:style w:customStyle="1" w:styleId="SectionNumber" w:type="character">
+  <w:style w:type="character" w:customStyle="1" w:styleId="SectionNumber">
     <w:name w:val="Section Number"/>
     <w:basedOn w:val="BodyTextChar"/>
   </w:style>
-  <w:style w:styleId="FootnoteReference" w:type="character">
+  <w:style w:type="character" w:styleId="FootnoteReference">
     <w:name w:val="Footnote Reference"/>
     <w:basedOn w:val="BodyTextChar"/>
     <w:rPr>
       <w:vertAlign w:val="superscript"/>
     </w:rPr>
   </w:style>
-  <w:style w:styleId="Hyperlink" w:type="character">
+  <w:style w:type="character" w:styleId="Hyperlink">
     <w:name w:val="Hyperlink"/>
     <w:basedOn w:val="BodyTextChar"/>
     <w:rPr>
-      <w:color w:themeColor="accent1" w:val="4F81BD"/>
-    </w:rPr>
-  </w:style>
-  <w:style w:styleId="TOCHeading" w:type="paragraph">
+      <w:color w:val="000000"/>
+    </w:rPr>
+  </w:style>
+  <w:style w:type="paragraph" w:styleId="TOCHeading">
     <w:name w:val="TOC Heading"/>
     <w:basedOn w:val="Heading1"/>
     <w:next w:val="BodyText"/>
@@ -1820,161 +2611,35 @@
       <w:outlineLvl w:val="9"/>
     </w:pPr>
     <w:rPr>
-      <w:rFonts w:asciiTheme="majorHAnsi" w:cstheme="majorBidi" w:eastAsiaTheme="majorEastAsia" w:hAnsiTheme="majorHAnsi"/>
+      <w:rFonts w:asciiTheme="majorHAnsi" w:eastAsiaTheme="majorEastAsia" w:hAnsiTheme="majorHAnsi" w:cstheme="majorBidi"/>
       <w:b w:val="0"/>
       <w:bCs w:val="0"/>
-      <w:color w:themeColor="accent1" w:themeShade="BF" w:val="365F91"/>
-    </w:rPr>
-  </w:style>
-  <w:style w:default="1" w:styleId="Normal" w:type="paragraph">
-    <w:name w:val="Normal"/>
-    <w:qFormat/>
-    <w:pPr>
-      <w:widowControl/>
-      <w:spacing w:after="0" w:before="0" w:line="520" w:lineRule="exact"/>
-    </w:pPr>
-    <w:rPr>
-      <w:rFonts w:ascii="EB Garamond" w:cs="EB Garamond" w:eastAsia="EB Garamond" w:hAnsi="EB Garamond"/>
-      <w:sz w:val="26"/>
-      <w:szCs w:val="26"/>
-    </w:rPr>
-  </w:style>
-  <w:style w:styleId="BodyText" w:type="paragraph">
-    <w:name w:val="Body Text"/>
-    <w:basedOn w:val="Normal"/>
-    <w:qFormat/>
-    <w:pPr>
-      <w:spacing w:after="0" w:before="0" w:line="520" w:lineRule="exact"/>
-      <w:ind w:firstLine="0"/>
-    </w:pPr>
-  </w:style>
-  <w:style w:styleId="FirstParagraph" w:type="paragraph">
-    <w:name w:val="First Paragraph"/>
-    <w:basedOn w:val="BodyText"/>
-    <w:next w:val="BodyText"/>
-    <w:qFormat/>
-  </w:style>
-  <w:style w:customStyle="1" w:styleId="Compact" w:type="paragraph">
-    <w:name w:val="Compact"/>
-    <w:basedOn w:val="BodyText"/>
-    <w:qFormat/>
-    <w:pPr>
-      <w:spacing w:after="0" w:before="0" w:line="300" w:lineRule="exact"/>
-      <w:ind w:firstLine="0"/>
-    </w:pPr>
-  </w:style>
-  <w:style w:styleId="Heading1" w:type="paragraph">
-    <w:name w:val="heading 1"/>
-    <w:basedOn w:val="Normal"/>
-    <w:next w:val="BodyText"/>
-    <w:uiPriority w:val="9"/>
-    <w:qFormat/>
-    <w:pPr>
-      <w:keepNext/>
-      <w:keepLines/>
-      <w:spacing w:after="520" w:before="520" w:line="300" w:lineRule="exact"/>
-      <w:ind w:firstLine="0"/>
-      <w:jc w:val="center"/>
-      <w:outlineLvl w:val="0"/>
-    </w:pPr>
-    <w:rPr>
-      <w:b/>
-      <w:bCs/>
-      <w:u w:val="single"/>
-    </w:rPr>
-  </w:style>
-  <w:style w:styleId="Heading2" w:type="paragraph">
-    <w:name w:val="heading 2"/>
-    <w:basedOn w:val="Normal"/>
-    <w:next w:val="BodyText"/>
-    <w:uiPriority w:val="9"/>
-    <w:unhideWhenUsed/>
-    <w:qFormat/>
-    <w:pPr>
-      <w:keepNext/>
-      <w:keepLines/>
-      <w:spacing w:after="520" w:before="520" w:line="300" w:lineRule="exact"/>
-      <w:ind w:firstLine="0"/>
-      <w:jc w:val="center"/>
-      <w:outlineLvl w:val="1"/>
-    </w:pPr>
-    <w:rPr>
-      <w:b/>
-      <w:bCs/>
-    </w:rPr>
-  </w:style>
-  <w:style w:styleId="FootnoteText" w:type="paragraph">
-    <w:name w:val="Footnote Text"/>
-    <w:basedOn w:val="Normal"/>
-    <w:uiPriority w:val="99"/>
-    <w:unhideWhenUsed/>
-    <w:pPr>
-      <w:spacing w:after="104" w:before="0" w:line="300" w:lineRule="exact"/>
-      <w:ind w:firstLine="0"/>
-    </w:pPr>
-    <w:rPr>
-      <w:sz w:val="26"/>
-      <w:szCs w:val="26"/>
-    </w:rPr>
-  </w:style>
-  <w:style w:styleId="BlockText" w:type="paragraph">
-    <w:name w:val="Block Text"/>
-    <w:basedOn w:val="BodyText"/>
-    <w:qFormat/>
-    <w:pPr>
-      <w:ind w:firstLine="720"/>
-    </w:pPr>
-  </w:style>
-  <w:style w:customStyle="1" w:styleId="NumberedParagraph" w:type="paragraph">
+      <w:color w:val="365F91" w:themeColor="accent1" w:themeShade="BF"/>
+    </w:rPr>
+  </w:style>
+  <w:style w:type="paragraph" w:customStyle="1" w:styleId="NumberedParagraph">
     <w:name w:val="Numbered Paragraph"/>
     <w:basedOn w:val="BodyText"/>
     <w:qFormat/>
     <w:pPr>
       <w:tabs>
-        <w:tab w:pos="1440" w:val="left"/>
+        <w:tab w:val="left" w:pos="1440"/>
       </w:tabs>
+      <w:spacing w:before="0" w:after="0" w:line="480" w:lineRule="exact"/>
       <w:ind w:firstLine="720"/>
     </w:pPr>
   </w:style>
-  <w:style w:customStyle="1" w:styleId="UnnumberedParagraph" w:type="paragraph">
-    <w:name w:val="Unnumbered Paragraph"/>
-    <w:basedOn w:val="BodyText"/>
-    <w:qFormat/>
-    <w:pPr>
-      <w:ind w:firstLine="720"/>
-    </w:pPr>
-  </w:style>
-  <w:style w:customStyle="1" w:styleId="ListLetter" w:type="paragraph">
+  <w:style w:type="paragraph" w:customStyle="1" w:styleId="ListLetter">
     <w:name w:val="List Letter"/>
     <w:basedOn w:val="BodyText"/>
     <w:qFormat/>
     <w:pPr>
       <w:tabs>
-        <w:tab w:pos="1296" w:val="left"/>
+        <w:tab w:val="left" w:pos="1296"/>
       </w:tabs>
-      <w:ind w:firstLine="0" w:left="720"/>
+      <w:spacing w:before="0" w:after="0" w:line="480" w:lineRule="exact"/>
+      <w:ind w:left="1296" w:hanging="576"/>
     </w:pPr>
-  </w:style>
-  <w:style w:default="1" w:styleId="Table" w:type="table">
-    <w:name w:val="Table"/>
-    <w:basedOn w:val="TableNormal"/>
-    <w:uiPriority w:val="59"/>
-    <w:tblPr>
-      <w:tblBorders>
-        <w:top w:val="nil"/>
-        <w:left w:val="nil"/>
-        <w:bottom w:val="nil"/>
-        <w:right w:val="nil"/>
-        <w:insideH w:val="nil"/>
-        <w:insideV w:val="nil"/>
-      </w:tblBorders>
-      <w:tblCellMar>
-        <w:top w:type="dxa" w:w="60"/>
-        <w:left w:type="dxa" w:w="120"/>
-        <w:bottom w:type="dxa" w:w="60"/>
-        <w:right w:type="dxa" w:w="120"/>
-      </w:tblCellMar>
-    </w:tblPr>
   </w:style>
   <w:style w:type="paragraph" w:customStyle="1" w:styleId="SourceCode">
     <w:name w:val="Source Code"/>

</xml_diff>